<commit_message>
[docs]: Adjustements to Level 1, 2 and 3 from C4 Diagram
</commit_message>
<xml_diff>
--- a/Documentacion/Movix_Documentacion_Arquitectura.docx
+++ b/Documentacion/Movix_Documentacion_Arquitectura.docx
@@ -1,6 +1,6 @@
 
 <file path=word/document.xml><?xml version="1.0" encoding="utf-8"?>
-<w:document xmlns:wpc="http://schemas.microsoft.com/office/word/2010/wordprocessingCanvas" xmlns:cx="http://schemas.microsoft.com/office/drawing/2014/chartex" xmlns:cx1="http://schemas.microsoft.com/office/drawing/2015/9/8/chartex" xmlns:cx2="http://schemas.microsoft.com/office/drawing/2015/10/21/chartex" xmlns:cx3="http://schemas.microsoft.com/office/drawing/2016/5/9/chartex" xmlns:cx4="http://schemas.microsoft.com/office/drawing/2016/5/10/chartex" xmlns:cx5="http://schemas.microsoft.com/office/drawing/2016/5/11/chartex" xmlns:cx6="http://schemas.microsoft.com/office/drawing/2016/5/12/chartex" xmlns:cx7="http://schemas.microsoft.com/office/drawing/2016/5/13/chartex" xmlns:cx8="http://schemas.microsoft.com/office/drawing/2016/5/14/chartex" xmlns:mc="http://schemas.openxmlformats.org/markup-compatibility/2006" xmlns:aink="http://schemas.microsoft.com/office/drawing/2016/ink" xmlns:am3d="http://schemas.microsoft.com/office/drawing/2017/model3d" xmlns:o="urn:schemas-microsoft-com:office:office" xmlns:oel="http://schemas.microsoft.com/office/2019/extlst" xmlns:r="http://schemas.openxmlformats.org/officeDocument/2006/relationships" xmlns:m="http://schemas.openxmlformats.org/officeDocument/2006/math" xmlns:v="urn:schemas-microsoft-com:vml" xmlns:wp14="http://schemas.microsoft.com/office/word/2010/wordprocessingDrawing" xmlns:wp="http://schemas.openxmlformats.org/drawingml/2006/wordprocessingDrawing" xmlns:w10="urn:schemas-microsoft-com:office:word" xmlns:w="http://schemas.openxmlformats.org/wordprocessingml/2006/main" xmlns:w14="http://schemas.microsoft.com/office/word/2010/wordml" xmlns:w15="http://schemas.microsoft.com/office/word/2012/wordml" xmlns:w16cei="http://schemas.microsoft.com/office/word/2026/wordml/cei" xmlns:w16cex="http://schemas.microsoft.com/office/word/2018/wordml/cex" xmlns:w16cid="http://schemas.microsoft.com/office/word/2016/wordml/cid" xmlns:w16="http://schemas.microsoft.com/office/word/2018/wordml" xmlns:w16du="http://schemas.microsoft.com/office/word/2023/wordml/word16du" xmlns:w16sdtdh="http://schemas.microsoft.com/office/word/2020/wordml/sdtdatahash" xmlns:w16sdtfl="http://schemas.microsoft.com/office/word/2024/wordml/sdtformatlock" xmlns:w16se="http://schemas.microsoft.com/office/word/2015/wordml/symex" xmlns:wpg="http://schemas.microsoft.com/office/word/2010/wordprocessingGroup" xmlns:wpi="http://schemas.microsoft.com/office/word/2010/wordprocessingInk" xmlns:wne="http://schemas.microsoft.com/office/word/2006/wordml" xmlns:wps="http://schemas.microsoft.com/office/word/2010/wordprocessingShape" mc:Ignorable="w14 w15 w16se w16cid w16 w16cex w16sdtdh w16sdtfl w16du wp14">
+<w:document xmlns:wpc="http://schemas.microsoft.com/office/word/2010/wordprocessingCanvas" xmlns:cx="http://schemas.microsoft.com/office/drawing/2014/chartex" xmlns:cx1="http://schemas.microsoft.com/office/drawing/2015/9/8/chartex" xmlns:cx2="http://schemas.microsoft.com/office/drawing/2015/10/21/chartex" xmlns:cx3="http://schemas.microsoft.com/office/drawing/2016/5/9/chartex" xmlns:cx4="http://schemas.microsoft.com/office/drawing/2016/5/10/chartex" xmlns:cx5="http://schemas.microsoft.com/office/drawing/2016/5/11/chartex" xmlns:cx6="http://schemas.microsoft.com/office/drawing/2016/5/12/chartex" xmlns:cx7="http://schemas.microsoft.com/office/drawing/2016/5/13/chartex" xmlns:cx8="http://schemas.microsoft.com/office/drawing/2016/5/14/chartex" xmlns:mc="http://schemas.openxmlformats.org/markup-compatibility/2006" xmlns:aink="http://schemas.microsoft.com/office/drawing/2016/ink" xmlns:am3d="http://schemas.microsoft.com/office/drawing/2017/model3d" xmlns:o="urn:schemas-microsoft-com:office:office" xmlns:oel="http://schemas.microsoft.com/office/2019/extlst" xmlns:r="http://schemas.openxmlformats.org/officeDocument/2006/relationships" xmlns:m="http://schemas.openxmlformats.org/officeDocument/2006/math" xmlns:v="urn:schemas-microsoft-com:vml" xmlns:wp14="http://schemas.microsoft.com/office/word/2010/wordprocessingDrawing" xmlns:wp="http://schemas.openxmlformats.org/drawingml/2006/wordprocessingDrawing" xmlns:w10="urn:schemas-microsoft-com:office:word" xmlns:w="http://schemas.openxmlformats.org/wordprocessingml/2006/main" xmlns:w14="http://schemas.microsoft.com/office/word/2010/wordml" xmlns:w15="http://schemas.microsoft.com/office/word/2012/wordml" xmlns:w16cex="http://schemas.microsoft.com/office/word/2018/wordml/cex" xmlns:w16cid="http://schemas.microsoft.com/office/word/2016/wordml/cid" xmlns:w16="http://schemas.microsoft.com/office/word/2018/wordml" xmlns:w16du="http://schemas.microsoft.com/office/word/2023/wordml/word16du" xmlns:w16sdtdh="http://schemas.microsoft.com/office/word/2020/wordml/sdtdatahash" xmlns:w16sdtfl="http://schemas.microsoft.com/office/word/2024/wordml/sdtformatlock" xmlns:w16se="http://schemas.microsoft.com/office/word/2015/wordml/symex" xmlns:wpg="http://schemas.microsoft.com/office/word/2010/wordprocessingGroup" xmlns:wpi="http://schemas.microsoft.com/office/word/2010/wordprocessingInk" xmlns:wne="http://schemas.microsoft.com/office/word/2006/wordml" xmlns:wps="http://schemas.microsoft.com/office/word/2010/wordprocessingShape" mc:Ignorable="w14 w15 w16se w16cid w16 w16cex w16sdtdh w16sdtfl w16du wp14">
   <w:body>
     <w:p>
       <w:pPr>
@@ -9496,8 +9496,13 @@
                 <w:szCs w:val="21"/>
               </w:rPr>
             </w:pPr>
-            <w:r>
-              <w:t xml:space="preserve">Elemento </w:t>
+            <w:proofErr w:type="spellStart"/>
+            <w:r>
+              <w:t>Elemento</w:t>
+            </w:r>
+            <w:proofErr w:type="spellEnd"/>
+            <w:r>
+              <w:t xml:space="preserve"> </w:t>
             </w:r>
             <w:proofErr w:type="spellStart"/>
             <w:r>
@@ -9966,7 +9971,7 @@
               <w:rPr>
                 <w:lang w:val="es-US"/>
               </w:rPr>
-              <w:t>Permiten la visualización y el cálculo de rutas.</w:t>
+              <w:t>Proporcionan mapas, cálculo de rutas y geolocalización en tiempo real.</w:t>
             </w:r>
           </w:p>
         </w:tc>
@@ -9988,6 +9993,38 @@
                 <w:lang w:val="es-US"/>
               </w:rPr>
               <w:t>Integración técnica externa pendiente de selección.</w:t>
+            </w:r>
+          </w:p>
+        </w:tc>
+      </w:tr>
+      <w:tr>
+        <w:tc>
+          <w:tcPr>
+            <w:tcW w:type="dxa" w:w="2802"/>
+          </w:tcPr>
+          <w:p>
+            <w:r>
+              <w:t>Servicio de notificaciones</w:t>
+            </w:r>
+          </w:p>
+        </w:tc>
+        <w:tc>
+          <w:tcPr>
+            <w:tcW w:type="dxa" w:w="4236"/>
+          </w:tcPr>
+          <w:p>
+            <w:r>
+              <w:t>Envía notificaciones Push, SMS y correo electrónico.</w:t>
+            </w:r>
+          </w:p>
+        </w:tc>
+        <w:tc>
+          <w:tcPr>
+            <w:tcW w:type="dxa" w:w="2826"/>
+          </w:tcPr>
+          <w:p>
+            <w:r>
+              <w:t>Integración técnica externa.</w:t>
             </w:r>
           </w:p>
         </w:tc>
@@ -10030,21 +10067,22 @@
           <w:noProof/>
         </w:rPr>
         <w:drawing>
-          <wp:inline distT="114300" distB="114300" distL="114300" distR="114300" wp14:anchorId="6BA54910" wp14:editId="3EF0CC5F">
-            <wp:extent cx="6126480" cy="6794500"/>
+          <wp:inline distT="0" distB="0" distL="0" distR="0" wp14:anchorId="19C9D3B3" wp14:editId="45903E20">
+            <wp:extent cx="6126480" cy="6786880"/>
             <wp:effectExtent l="0" t="0" r="0" b="0"/>
-            <wp:docPr id="3" name="image2.jpg"/>
-            <wp:cNvGraphicFramePr/>
+            <wp:docPr id="2102046580" name="Picture 3" descr="A diagram of a system&#10;&#10;AI-generated content may be incorrect."/>
+            <wp:cNvGraphicFramePr>
+              <a:graphicFrameLocks xmlns:a="http://schemas.openxmlformats.org/drawingml/2006/main" noChangeAspect="1"/>
+            </wp:cNvGraphicFramePr>
             <a:graphic xmlns:a="http://schemas.openxmlformats.org/drawingml/2006/main">
               <a:graphicData uri="http://schemas.openxmlformats.org/drawingml/2006/picture">
                 <pic:pic xmlns:pic="http://schemas.openxmlformats.org/drawingml/2006/picture">
                   <pic:nvPicPr>
-                    <pic:cNvPr id="0" name="image2.jpg"/>
-                    <pic:cNvPicPr preferRelativeResize="0"/>
+                    <pic:cNvPr id="2102046580" name="Picture 3" descr="A diagram of a system&#10;&#10;AI-generated content may be incorrect."/>
+                    <pic:cNvPicPr/>
                   </pic:nvPicPr>
                   <pic:blipFill>
                     <a:blip r:embed="rId9"/>
-                    <a:srcRect/>
                     <a:stretch>
                       <a:fillRect/>
                     </a:stretch>
@@ -10052,12 +10090,11 @@
                   <pic:spPr>
                     <a:xfrm>
                       <a:off x="0" y="0"/>
-                      <a:ext cx="6126480" cy="6794500"/>
+                      <a:ext cx="6126480" cy="6786880"/>
                     </a:xfrm>
                     <a:prstGeom prst="rect">
                       <a:avLst/>
                     </a:prstGeom>
-                    <a:ln/>
                   </pic:spPr>
                 </pic:pic>
               </a:graphicData>
@@ -10404,67 +10441,57 @@
         <w:rPr>
           <w:lang w:val="es-CR"/>
         </w:rPr>
-        <w:t xml:space="preserve">El acceso al sistema se realiza </w:t>
-      </w:r>
-      <w:r>
-        <w:rPr>
-          <w:lang w:val="es-CR"/>
-        </w:rPr>
-        <w:t>mediante</w:t>
-      </w:r>
-      <w:r>
-        <w:rPr>
-          <w:lang w:val="es-CR"/>
-        </w:rPr>
-        <w:t xml:space="preserve"> dos aplicaciones cliente. La aplicación web está orientada principalmente a los administradores de cada operador y concentra las funciones relacionadas con la configuración de rutas, </w:t>
-      </w:r>
-      <w:r>
-        <w:rPr>
-          <w:lang w:val="es-CR"/>
-        </w:rPr>
-        <w:t xml:space="preserve">la gestión de usuarios, la administración de vehículos, choferes y pasajeros, y el </w:t>
-      </w:r>
-      <w:r>
-        <w:rPr>
-          <w:lang w:val="es-CR"/>
-        </w:rPr>
-        <w:t xml:space="preserve">monitoreo general de la operación. Por otra parte, la aplicación móvil es utilizada por choferes y clientes, </w:t>
-      </w:r>
-      <w:r>
-        <w:rPr>
-          <w:lang w:val="es-CR"/>
-        </w:rPr>
-        <w:t>lo que permite</w:t>
-      </w:r>
-      <w:r>
-        <w:rPr>
-          <w:lang w:val="es-CR"/>
-        </w:rPr>
-        <w:t xml:space="preserve"> registrar abordajes y entregas, consultar </w:t>
-      </w:r>
-      <w:r>
-        <w:rPr>
-          <w:lang w:val="es-CR"/>
-        </w:rPr>
-        <w:t>en tiempo real la ubicación de los vehículos</w:t>
-      </w:r>
-      <w:r>
-        <w:rPr>
-          <w:lang w:val="es-CR"/>
-        </w:rPr>
-        <w:t xml:space="preserve">, recibir notificaciones y gestionar solicitudes especiales desde cualquier </w:t>
-      </w:r>
-      <w:r>
-        <w:rPr>
-          <w:lang w:val="es-CR"/>
-        </w:rPr>
-        <w:t>lugar</w:t>
-      </w:r>
-      <w:r>
-        <w:rPr>
-          <w:lang w:val="es-CR"/>
-        </w:rPr>
-        <w:t>.</w:t>
+        <w:t>El acceso al sistema se realiza mediante dos aplicaciones cliente. La aplicación web está orientada principalmente a los administradores de cada operador y concentra la configuración de rutas y choferes, la gestión de usuarios, el monitoreo general de la operación y el seguimiento de incidentes. Por otra parte, la aplicación móvil es utilizada por choferes y clientes, lo que permite registrar abordajes y entregas, consultar en tiempo real la ubicación de los vehículos, recibir notificaciones y gestionar solicitudes especiales desde cualquier lugar.</w:t>
+      </w:r>
+      <w:r>
+        <w:rPr>
+          <w:lang w:val="es-CR"/>
+        </w:rPr>
+      </w:r>
+      <w:r>
+        <w:rPr>
+          <w:lang w:val="es-CR"/>
+        </w:rPr>
+      </w:r>
+      <w:r>
+        <w:rPr>
+          <w:lang w:val="es-CR"/>
+        </w:rPr>
+      </w:r>
+      <w:r>
+        <w:rPr>
+          <w:lang w:val="es-CR"/>
+        </w:rPr>
+      </w:r>
+      <w:r>
+        <w:rPr>
+          <w:lang w:val="es-CR"/>
+        </w:rPr>
+      </w:r>
+      <w:r>
+        <w:rPr>
+          <w:lang w:val="es-CR"/>
+        </w:rPr>
+      </w:r>
+      <w:r>
+        <w:rPr>
+          <w:lang w:val="es-CR"/>
+        </w:rPr>
+      </w:r>
+      <w:r>
+        <w:rPr>
+          <w:lang w:val="es-CR"/>
+        </w:rPr>
+      </w:r>
+      <w:r>
+        <w:rPr>
+          <w:lang w:val="es-CR"/>
+        </w:rPr>
+      </w:r>
+      <w:r>
+        <w:rPr>
+          <w:lang w:val="es-CR"/>
+        </w:rPr>
       </w:r>
     </w:p>
     <w:p>
@@ -10503,14 +10530,14 @@
         <w:rPr>
           <w:lang w:val="es-CR"/>
         </w:rPr>
-        <w:t>, como la autenticación, la autorización, la validación de solicitudes, el control de acceso por operador (</w:t>
+        <w:t>, como la autenticación, la autorización, la validación de solicitudes, el control de acceso por operador (multi-</w:t>
       </w:r>
       <w:proofErr w:type="spellStart"/>
       <w:r>
         <w:rPr>
           <w:lang w:val="es-CR"/>
         </w:rPr>
-        <w:t>multi-tenancy</w:t>
+        <w:t>tenancy</w:t>
       </w:r>
       <w:proofErr w:type="spellEnd"/>
       <w:r>
@@ -10544,19 +10571,17 @@
         <w:rPr>
           <w:lang w:val="es-CR"/>
         </w:rPr>
-        <w:t xml:space="preserve">La lógica de negocio se distribuye entre distintos microservicios especializados. El Servicio Principal concentra la gestión de operadores, usuarios, perfiles médicos, vehículos y configuraciones generales de la plataforma. El Servicio de Operaciones administra los procesos asociados a la ejecución diaria del servicio de transporte, incluyendo la planificación y </w:t>
-      </w:r>
-      <w:r>
-        <w:rPr>
-          <w:lang w:val="es-CR"/>
-        </w:rPr>
-        <w:t xml:space="preserve">el </w:t>
-      </w:r>
-      <w:r>
-        <w:rPr>
-          <w:lang w:val="es-CR"/>
-        </w:rPr>
-        <w:t>seguimiento de rutas, el registro de abordajes y entregas, la atención de incidentes y la gestión de solicitudes especiales. Finalmente, el Servicio de Interacción coordina la comunicación con servicios externos y procesa eventos relacionados con el envío de notificaciones, manteniendo desacopladas las funcionalidades transversales del núcleo operativo del sistema.</w:t>
+        <w:t>La lógica de negocio se distribuye entre distintos microservicios especializados. El Servicio Principal concentra la gestión de operadores, configuración, usuarios y roles, clientes y pasajeros, perfiles médicos o veterinarios y choferes. El Servicio de Operaciones administra los procesos asociados a la ejecución diaria del servicio de transporte, incluyendo la planificación y el seguimiento de rutas, el registro de abordajes y entregas, la atención de incidentes y la gestión de solicitudes especiales. Finalmente, el Servicio de Interacción consume eventos operativos para orquestar notificaciones y registrar la auditoría y el estado de envío, manteniendo desacopladas estas funcionalidades transversales del núcleo operativo del sistema.</w:t>
+      </w:r>
+      <w:r>
+        <w:rPr>
+          <w:lang w:val="es-CR"/>
+        </w:rPr>
+      </w:r>
+      <w:r>
+        <w:rPr>
+          <w:lang w:val="es-CR"/>
+        </w:rPr>
       </w:r>
     </w:p>
     <w:p>
@@ -11813,23 +11838,39 @@
       <w:bookmarkEnd w:id="30"/>
       <w:proofErr w:type="spellEnd"/>
     </w:p>
+    <w:p/>
     <w:p>
+      <w:pPr>
+        <w:rPr>
+          <w:lang w:val="es-CR"/>
+        </w:rPr>
+        <w:sectPr>
+          <w:pgSz w:w="15840" w:h="12240" w:orient="landscape"/>
+          <w:pgMar w:top="1298" w:right="1151" w:bottom="1298" w:left="1151" w:header="720" w:footer="720" w:gutter="0"/>
+          <w:cols w:space="720"/>
+          <w:titlePg/>
+          <w:docGrid w:linePitch="360"/>
+        </w:sectPr>
+      </w:pPr>
       <w:r>
         <w:rPr>
           <w:noProof/>
+          <w:lang w:val="es-CR"/>
         </w:rPr>
         <w:drawing>
-          <wp:inline distT="114300" distB="114300" distL="114300" distR="114300" wp14:anchorId="1D831929" wp14:editId="4D246969">
-            <wp:extent cx="8849001" cy="5257890"/>
-            <wp:effectExtent l="0" t="0" r="9525" b="0"/>
-            <wp:docPr id="446973979" name="image3.jpg"/>
-            <wp:cNvGraphicFramePr/>
+          <wp:inline distT="0" distB="0" distL="0" distR="0" wp14:anchorId="1B9A1C13" wp14:editId="3296AFA9">
+            <wp:extent cx="8596630" cy="5107940"/>
+            <wp:effectExtent l="0" t="0" r="1270" b="0"/>
+            <wp:docPr id="1119674472" name="Picture 4" descr="A computer screen shot of a diagram&#10;&#10;AI-generated content may be incorrect."/>
+            <wp:cNvGraphicFramePr>
+              <a:graphicFrameLocks xmlns:a="http://schemas.openxmlformats.org/drawingml/2006/main" noChangeAspect="1"/>
+            </wp:cNvGraphicFramePr>
             <a:graphic xmlns:a="http://schemas.openxmlformats.org/drawingml/2006/main">
               <a:graphicData uri="http://schemas.openxmlformats.org/drawingml/2006/picture">
                 <pic:pic xmlns:pic="http://schemas.openxmlformats.org/drawingml/2006/picture">
                   <pic:nvPicPr>
-                    <pic:cNvPr id="446973979" name="image3.jpg"/>
-                    <pic:cNvPicPr preferRelativeResize="0"/>
+                    <pic:cNvPr id="1119674472" name="Picture 4" descr="A computer screen shot of a diagram&#10;&#10;AI-generated content may be incorrect."/>
+                    <pic:cNvPicPr/>
                   </pic:nvPicPr>
                   <pic:blipFill>
                     <a:blip r:embed="rId12"/>
@@ -11840,12 +11881,11 @@
                   <pic:spPr>
                     <a:xfrm>
                       <a:off x="0" y="0"/>
-                      <a:ext cx="8849001" cy="5257890"/>
+                      <a:ext cx="8596630" cy="5107940"/>
                     </a:xfrm>
                     <a:prstGeom prst="rect">
                       <a:avLst/>
                     </a:prstGeom>
-                    <a:ln/>
                   </pic:spPr>
                 </pic:pic>
               </a:graphicData>
@@ -11859,20 +11899,6 @@
         <w:rPr>
           <w:lang w:val="es-CR"/>
         </w:rPr>
-        <w:sectPr>
-          <w:pgSz w:w="15840" w:h="12240" w:orient="landscape"/>
-          <w:pgMar w:top="1298" w:right="1151" w:bottom="1298" w:left="1151" w:header="720" w:footer="720" w:gutter="0"/>
-          <w:cols w:space="720"/>
-          <w:titlePg/>
-          <w:docGrid w:linePitch="360"/>
-        </w:sectPr>
-      </w:pPr>
-    </w:p>
-    <w:p>
-      <w:pPr>
-        <w:rPr>
-          <w:lang w:val="es-CR"/>
-        </w:rPr>
       </w:pPr>
       <w:r>
         <w:rPr>
@@ -12016,49 +12042,42 @@
         <w:rPr>
           <w:lang w:val="es-CR"/>
         </w:rPr>
-        <w:t xml:space="preserve">La Aplicación Web </w:t>
-      </w:r>
-      <w:r>
-        <w:rPr>
-          <w:lang w:val="es-CR"/>
-        </w:rPr>
-        <w:t>es</w:t>
-      </w:r>
-      <w:r>
-        <w:rPr>
-          <w:lang w:val="es-CR"/>
-        </w:rPr>
-        <w:t xml:space="preserve"> la interfaz </w:t>
-      </w:r>
-      <w:r>
-        <w:rPr>
-          <w:lang w:val="es-CR"/>
-        </w:rPr>
-        <w:t xml:space="preserve">principal </w:t>
-      </w:r>
-      <w:r>
-        <w:rPr>
-          <w:lang w:val="es-CR"/>
-        </w:rPr>
-        <w:t>que utilizan</w:t>
-      </w:r>
-      <w:r>
-        <w:rPr>
-          <w:lang w:val="es-CR"/>
-        </w:rPr>
-        <w:t xml:space="preserve"> los administradores de cada operador. Desde este componente se realizan actividades relacionadas con la configuración de rutas, </w:t>
-      </w:r>
-      <w:r>
-        <w:rPr>
-          <w:lang w:val="es-CR"/>
-        </w:rPr>
-        <w:t xml:space="preserve">la administración de usuarios, la gestión de vehículos, el monitoreo operativo y el </w:t>
-      </w:r>
-      <w:r>
-        <w:rPr>
-          <w:lang w:val="es-CR"/>
-        </w:rPr>
-        <w:t>seguimiento de incidentes. La aplicación consume los servicios internos mediante el API Gateway utilizando comunicación REST sobre HTTPS.</w:t>
+        <w:t>La Aplicación Web es la interfaz principal que utilizan los administradores de cada operador. Desde este componente se realizan actividades relacionadas con la configuración de rutas y choferes, la administración de usuarios, el monitoreo operativo y el seguimiento de incidentes. La aplicación consume los servicios internos mediante el API Gateway utilizando comunicación REST sobre HTTPS.</w:t>
+      </w:r>
+      <w:r>
+        <w:rPr>
+          <w:lang w:val="es-CR"/>
+        </w:rPr>
+      </w:r>
+      <w:r>
+        <w:rPr>
+          <w:lang w:val="es-CR"/>
+        </w:rPr>
+      </w:r>
+      <w:r>
+        <w:rPr>
+          <w:lang w:val="es-CR"/>
+        </w:rPr>
+      </w:r>
+      <w:r>
+        <w:rPr>
+          <w:lang w:val="es-CR"/>
+        </w:rPr>
+      </w:r>
+      <w:r>
+        <w:rPr>
+          <w:lang w:val="es-CR"/>
+        </w:rPr>
+      </w:r>
+      <w:r>
+        <w:rPr>
+          <w:lang w:val="es-CR"/>
+        </w:rPr>
+      </w:r>
+      <w:r>
+        <w:rPr>
+          <w:lang w:val="es-CR"/>
+        </w:rPr>
       </w:r>
     </w:p>
     <w:p>
@@ -12216,43 +12235,37 @@
         <w:rPr>
           <w:lang w:val="es-CR"/>
         </w:rPr>
-        <w:t xml:space="preserve">Este microservicio administra la información </w:t>
-      </w:r>
-      <w:r>
-        <w:rPr>
-          <w:lang w:val="es-CR"/>
-        </w:rPr>
-        <w:t xml:space="preserve">de </w:t>
-      </w:r>
-      <w:r>
-        <w:rPr>
-          <w:lang w:val="es-CR"/>
-        </w:rPr>
-        <w:t xml:space="preserve">base del sistema, incluyendo operadores, usuarios, perfiles médicos, vehículos, choferes y configuraciones generales de la plataforma. Asimismo, coordina las operaciones </w:t>
-      </w:r>
-      <w:r>
-        <w:rPr>
-          <w:lang w:val="es-CR"/>
-        </w:rPr>
-        <w:t>de</w:t>
-      </w:r>
-      <w:r>
-        <w:rPr>
-          <w:lang w:val="es-CR"/>
-        </w:rPr>
-        <w:t xml:space="preserve"> administración del negocio y mantiene la consistencia de la información maestra utilizada por </w:t>
-      </w:r>
-      <w:r>
-        <w:rPr>
-          <w:lang w:val="es-CR"/>
-        </w:rPr>
-        <w:t>los demás</w:t>
-      </w:r>
-      <w:r>
-        <w:rPr>
-          <w:lang w:val="es-CR"/>
-        </w:rPr>
-        <w:t xml:space="preserve"> servicios.</w:t>
+        <w:t>Este microservicio administra la información de base del sistema, incluyendo operadores, configuraciones, usuarios y roles, clientes y pasajeros, perfiles médicos o veterinarios y choferes. Asimismo, coordina las operaciones de administración del negocio y mantiene la consistencia de la información maestra utilizada por los demás servicios.</w:t>
+      </w:r>
+      <w:r>
+        <w:rPr>
+          <w:lang w:val="es-CR"/>
+        </w:rPr>
+      </w:r>
+      <w:r>
+        <w:rPr>
+          <w:lang w:val="es-CR"/>
+        </w:rPr>
+      </w:r>
+      <w:r>
+        <w:rPr>
+          <w:lang w:val="es-CR"/>
+        </w:rPr>
+      </w:r>
+      <w:r>
+        <w:rPr>
+          <w:lang w:val="es-CR"/>
+        </w:rPr>
+      </w:r>
+      <w:r>
+        <w:rPr>
+          <w:lang w:val="es-CR"/>
+        </w:rPr>
+      </w:r>
+      <w:r>
+        <w:rPr>
+          <w:lang w:val="es-CR"/>
+        </w:rPr>
       </w:r>
     </w:p>
     <w:p>
@@ -12363,31 +12376,27 @@
         <w:rPr>
           <w:lang w:val="es-CR"/>
         </w:rPr>
-        <w:t xml:space="preserve">Este servicio gestiona la comunicación con plataformas externas y procesa eventos relacionados con el envío de notificaciones, </w:t>
-      </w:r>
-      <w:r>
-        <w:rPr>
-          <w:lang w:val="es-CR"/>
-        </w:rPr>
-        <w:t>lo que permite</w:t>
-      </w:r>
-      <w:r>
-        <w:rPr>
-          <w:lang w:val="es-CR"/>
-        </w:rPr>
-        <w:t xml:space="preserve"> desacoplar estas funcionalidades del flujo </w:t>
-      </w:r>
-      <w:r>
-        <w:rPr>
-          <w:lang w:val="es-CR"/>
-        </w:rPr>
-        <w:t>de operación principal</w:t>
-      </w:r>
-      <w:r>
-        <w:rPr>
-          <w:lang w:val="es-CR"/>
-        </w:rPr>
-        <w:t>. Su diseño facilita incorporar nuevos canales de comunicación sin modificar la lógica del negocio.</w:t>
+        <w:t>Este servicio consume eventos operativos para orquestar notificaciones, registrar la auditoría y conservar el estado de envío. Gestiona la comunicación con plataformas externas, lo que permite desacoplar estas funcionalidades del flujo de operación principal y facilita incorporar nuevos canales sin modificar la lógica del negocio.</w:t>
+      </w:r>
+      <w:r>
+        <w:rPr>
+          <w:lang w:val="es-CR"/>
+        </w:rPr>
+      </w:r>
+      <w:r>
+        <w:rPr>
+          <w:lang w:val="es-CR"/>
+        </w:rPr>
+      </w:r>
+      <w:r>
+        <w:rPr>
+          <w:lang w:val="es-CR"/>
+        </w:rPr>
+      </w:r>
+      <w:r>
+        <w:rPr>
+          <w:lang w:val="es-CR"/>
+        </w:rPr>
       </w:r>
     </w:p>
     <w:p>
@@ -12423,31 +12432,27 @@
         <w:rPr>
           <w:lang w:val="es-CR"/>
         </w:rPr>
-        <w:t xml:space="preserve">El Bus de Eventos implementa un mecanismo de comunicación asíncrona entre los distintos microservicios </w:t>
-      </w:r>
-      <w:r>
-        <w:rPr>
-          <w:lang w:val="es-CR"/>
-        </w:rPr>
-        <w:t>mediante</w:t>
-      </w:r>
-      <w:r>
-        <w:rPr>
-          <w:lang w:val="es-CR"/>
-        </w:rPr>
-        <w:t xml:space="preserve"> Apache Kafka. Su función es distribuir eventos relevantes de la operación, como incidentes, confirmaciones de abordaje o alertas de emergencia, permitiendo que otros servicios reaccionen sin depender directamente del componente que </w:t>
-      </w:r>
-      <w:r>
-        <w:rPr>
-          <w:lang w:val="es-CR"/>
-        </w:rPr>
-        <w:t>los originó</w:t>
-      </w:r>
-      <w:r>
-        <w:rPr>
-          <w:lang w:val="es-CR"/>
-        </w:rPr>
-        <w:t>.</w:t>
+        <w:t>El Bus de Eventos implementa un mecanismo de comunicación asíncrona entre los distintos microservicios mediante Apache Kafka. Su función es distribuir eventos relevantes de la operación: abordajes, entregas, solicitudes especiales e incidentes, permitiendo que otros servicios reaccionen sin depender directamente del componente que los originó.</w:t>
+      </w:r>
+      <w:r>
+        <w:rPr>
+          <w:lang w:val="es-CR"/>
+        </w:rPr>
+      </w:r>
+      <w:r>
+        <w:rPr>
+          <w:lang w:val="es-CR"/>
+        </w:rPr>
+      </w:r>
+      <w:r>
+        <w:rPr>
+          <w:lang w:val="es-CR"/>
+        </w:rPr>
+      </w:r>
+      <w:r>
+        <w:rPr>
+          <w:lang w:val="es-CR"/>
+        </w:rPr>
       </w:r>
     </w:p>
     <w:p>
@@ -12733,10 +12738,10 @@
           <w:lang w:val="es-CR"/>
         </w:rPr>
         <w:drawing>
-          <wp:inline distT="0" distB="0" distL="0" distR="0" wp14:anchorId="47717297" wp14:editId="0EE09D4D">
-            <wp:extent cx="6123940" cy="4955540"/>
+          <wp:inline distT="0" distB="0" distL="0" distR="0" wp14:anchorId="230AED19" wp14:editId="4F9B2198">
+            <wp:extent cx="6123940" cy="5033010"/>
             <wp:effectExtent l="0" t="0" r="0" b="0"/>
-            <wp:docPr id="639580676" name="Imagen 1"/>
+            <wp:docPr id="677349417" name="Picture 5" descr="A screenshot of a computer&#10;&#10;AI-generated content may be incorrect."/>
             <wp:cNvGraphicFramePr>
               <a:graphicFrameLocks xmlns:a="http://schemas.openxmlformats.org/drawingml/2006/main" noChangeAspect="1"/>
             </wp:cNvGraphicFramePr>
@@ -12744,7 +12749,7 @@
               <a:graphicData uri="http://schemas.openxmlformats.org/drawingml/2006/picture">
                 <pic:pic xmlns:pic="http://schemas.openxmlformats.org/drawingml/2006/picture">
                   <pic:nvPicPr>
-                    <pic:cNvPr id="639580676" name="Imagen 639580676"/>
+                    <pic:cNvPr id="677349417" name="Picture 5" descr="A screenshot of a computer&#10;&#10;AI-generated content may be incorrect."/>
                     <pic:cNvPicPr/>
                   </pic:nvPicPr>
                   <pic:blipFill>
@@ -12756,7 +12761,7 @@
                   <pic:spPr>
                     <a:xfrm>
                       <a:off x="0" y="0"/>
-                      <a:ext cx="6123940" cy="4955540"/>
+                      <a:ext cx="6123940" cy="5033010"/>
                     </a:xfrm>
                     <a:prstGeom prst="rect">
                       <a:avLst/>
@@ -12840,7 +12845,7 @@
                 <w:bCs w:val="0"/>
                 <w:sz w:val="20"/>
               </w:rPr>
-              <w:t>Módulo</w:t>
+              <w:t>Gestor de Sesión y Autenticación</w:t>
             </w:r>
             <w:proofErr w:type="spellEnd"/>
             <w:r>
@@ -12848,7 +12853,6 @@
                 <w:bCs w:val="0"/>
                 <w:sz w:val="20"/>
               </w:rPr>
-              <w:t xml:space="preserve"> de </w:t>
             </w:r>
             <w:proofErr w:type="spellStart"/>
             <w:r>
@@ -12856,7 +12860,6 @@
                 <w:bCs w:val="0"/>
                 <w:sz w:val="20"/>
               </w:rPr>
-              <w:t>Autenticación</w:t>
             </w:r>
             <w:proofErr w:type="spellEnd"/>
           </w:p>
@@ -12901,7 +12904,7 @@
                 <w:sz w:val="20"/>
                 <w:lang w:val="es-CR"/>
               </w:rPr>
-              <w:t>Módulo de Configuración de Rutas y Flota</w:t>
+              <w:t>Módulo de Configuración de Rutas y Choferes</w:t>
             </w:r>
           </w:p>
         </w:tc>
@@ -12921,7 +12924,7 @@
                 <w:sz w:val="20"/>
                 <w:lang w:val="es-CR"/>
               </w:rPr>
-              <w:t>Permite configurar rutas, vehículos y choferes.</w:t>
+              <w:t>Permite configurar rutas y choferes.</w:t>
             </w:r>
           </w:p>
         </w:tc>
@@ -13099,21 +13102,12 @@
                 <w:bCs w:val="0"/>
               </w:rPr>
             </w:pPr>
-            <w:proofErr w:type="spellStart"/>
             <w:r>
               <w:rPr>
                 <w:bCs w:val="0"/>
                 <w:sz w:val="20"/>
               </w:rPr>
-              <w:t>Cliente</w:t>
-            </w:r>
-            <w:proofErr w:type="spellEnd"/>
-            <w:r>
-              <w:rPr>
-                <w:bCs w:val="0"/>
-                <w:sz w:val="20"/>
-              </w:rPr>
-              <w:t xml:space="preserve"> API (Axios)</w:t>
+              <w:t>Cliente API (Axios)</w:t>
             </w:r>
           </w:p>
         </w:tc>
@@ -13205,10 +13199,10 @@
           <w:lang w:val="es-CR"/>
         </w:rPr>
         <w:drawing>
-          <wp:inline distT="0" distB="0" distL="0" distR="0" wp14:anchorId="7F701B79" wp14:editId="10FAF851">
-            <wp:extent cx="6123940" cy="5414010"/>
-            <wp:effectExtent l="0" t="0" r="0" b="0"/>
-            <wp:docPr id="1457132507" name="Imagen 2"/>
+          <wp:inline distT="0" distB="0" distL="0" distR="0" wp14:anchorId="04E2EBFD" wp14:editId="6E1BD90D">
+            <wp:extent cx="6123940" cy="5417820"/>
+            <wp:effectExtent l="0" t="0" r="0" b="5080"/>
+            <wp:docPr id="1494939706" name="Picture 6"/>
             <wp:cNvGraphicFramePr>
               <a:graphicFrameLocks xmlns:a="http://schemas.openxmlformats.org/drawingml/2006/main" noChangeAspect="1"/>
             </wp:cNvGraphicFramePr>
@@ -13216,7 +13210,7 @@
               <a:graphicData uri="http://schemas.openxmlformats.org/drawingml/2006/picture">
                 <pic:pic xmlns:pic="http://schemas.openxmlformats.org/drawingml/2006/picture">
                   <pic:nvPicPr>
-                    <pic:cNvPr id="1457132507" name="Imagen 1457132507"/>
+                    <pic:cNvPr id="1494939706" name="Picture 1494939706"/>
                     <pic:cNvPicPr/>
                   </pic:nvPicPr>
                   <pic:blipFill>
@@ -13228,7 +13222,7 @@
                   <pic:spPr>
                     <a:xfrm>
                       <a:off x="0" y="0"/>
-                      <a:ext cx="6123940" cy="5414010"/>
+                      <a:ext cx="6123940" cy="5417820"/>
                     </a:xfrm>
                     <a:prstGeom prst="rect">
                       <a:avLst/>
@@ -13557,21 +13551,12 @@
                 <w:bCs w:val="0"/>
               </w:rPr>
             </w:pPr>
-            <w:proofErr w:type="spellStart"/>
             <w:r>
               <w:rPr>
                 <w:bCs w:val="0"/>
                 <w:sz w:val="20"/>
               </w:rPr>
-              <w:t>Cliente</w:t>
-            </w:r>
-            <w:proofErr w:type="spellEnd"/>
-            <w:r>
-              <w:rPr>
-                <w:bCs w:val="0"/>
-                <w:sz w:val="20"/>
-              </w:rPr>
-              <w:t xml:space="preserve"> API (Axios)</w:t>
+              <w:t>Cliente API (Axios)</w:t>
             </w:r>
           </w:p>
         </w:tc>
@@ -13656,10 +13641,10 @@
           <w:lang w:val="es-CR"/>
         </w:rPr>
         <w:drawing>
-          <wp:inline distT="0" distB="0" distL="0" distR="0" wp14:anchorId="785E9313" wp14:editId="735E4446">
-            <wp:extent cx="6123940" cy="4363085"/>
-            <wp:effectExtent l="0" t="0" r="0" b="0"/>
-            <wp:docPr id="1070648164" name="Imagen 3"/>
+          <wp:inline distT="0" distB="0" distL="0" distR="0" wp14:anchorId="5E89FDB5" wp14:editId="7143EA43">
+            <wp:extent cx="6123940" cy="4605655"/>
+            <wp:effectExtent l="0" t="0" r="0" b="4445"/>
+            <wp:docPr id="2081035753" name="Picture 7"/>
             <wp:cNvGraphicFramePr>
               <a:graphicFrameLocks xmlns:a="http://schemas.openxmlformats.org/drawingml/2006/main" noChangeAspect="1"/>
             </wp:cNvGraphicFramePr>
@@ -13667,7 +13652,7 @@
               <a:graphicData uri="http://schemas.openxmlformats.org/drawingml/2006/picture">
                 <pic:pic xmlns:pic="http://schemas.openxmlformats.org/drawingml/2006/picture">
                   <pic:nvPicPr>
-                    <pic:cNvPr id="1070648164" name="Imagen 1070648164"/>
+                    <pic:cNvPr id="2081035753" name="Picture 2081035753"/>
                     <pic:cNvPicPr/>
                   </pic:nvPicPr>
                   <pic:blipFill>
@@ -13679,7 +13664,7 @@
                   <pic:spPr>
                     <a:xfrm>
                       <a:off x="0" y="0"/>
-                      <a:ext cx="6123940" cy="4363085"/>
+                      <a:ext cx="6123940" cy="4605655"/>
                     </a:xfrm>
                     <a:prstGeom prst="rect">
                       <a:avLst/>
@@ -13763,7 +13748,7 @@
                 <w:bCs w:val="0"/>
                 <w:sz w:val="20"/>
               </w:rPr>
-              <w:t>Autorizador</w:t>
+              <w:t>Autorizador de Acceso</w:t>
             </w:r>
             <w:proofErr w:type="spellEnd"/>
             <w:r>
@@ -13771,7 +13756,6 @@
                 <w:bCs w:val="0"/>
                 <w:sz w:val="20"/>
               </w:rPr>
-              <w:t xml:space="preserve"> </w:t>
             </w:r>
             <w:proofErr w:type="spellStart"/>
             <w:r>
@@ -13779,7 +13763,6 @@
                 <w:bCs w:val="0"/>
                 <w:sz w:val="20"/>
               </w:rPr>
-              <w:t>Personalizado</w:t>
             </w:r>
             <w:proofErr w:type="spellEnd"/>
           </w:p>
@@ -13800,7 +13783,7 @@
                 <w:sz w:val="20"/>
                 <w:lang w:val="es-CR"/>
               </w:rPr>
-              <w:t>Verifica el token del proveedor de identidad y resuelve el contexto del operador.</w:t>
+              <w:t>Delega al Servicio Principal la validación del token y la resolución del contexto del operador.</w:t>
             </w:r>
           </w:p>
         </w:tc>
@@ -13970,7 +13953,7 @@
                 <w:sz w:val="20"/>
                 <w:lang w:val="es-CR"/>
               </w:rPr>
-              <w:t xml:space="preserve">Enrutamiento de Recursos y Métodos / Integración con </w:t>
+              <w:t>Enrutamiento de Recursos y Métodos</w:t>
             </w:r>
             <w:proofErr w:type="spellStart"/>
             <w:r>
@@ -13979,7 +13962,6 @@
                 <w:sz w:val="20"/>
                 <w:lang w:val="es-CR"/>
               </w:rPr>
-              <w:t>Backend</w:t>
             </w:r>
             <w:proofErr w:type="spellEnd"/>
           </w:p>
@@ -14000,7 +13982,29 @@
                 <w:sz w:val="20"/>
                 <w:lang w:val="es-CR"/>
               </w:rPr>
-              <w:t>Enruta cada solicitud REST al microservicio correspondiente.</w:t>
+              <w:t>Enruta cada solicitud REST al microservicio correspondiente según el recurso.</w:t>
+            </w:r>
+          </w:p>
+        </w:tc>
+      </w:tr>
+      <w:tr>
+        <w:tc>
+          <w:tcPr>
+            <w:tcW w:type="dxa" w:w="4822"/>
+          </w:tcPr>
+          <w:p>
+            <w:r>
+              <w:t>Integración con Backend</w:t>
+            </w:r>
+          </w:p>
+        </w:tc>
+        <w:tc>
+          <w:tcPr>
+            <w:tcW w:type="dxa" w:w="4822"/>
+          </w:tcPr>
+          <w:p>
+            <w:r>
+              <w:t>Conecta el Gateway con Servicio Principal y Servicio de Operaciones.</w:t>
             </w:r>
           </w:p>
         </w:tc>
@@ -14098,10 +14102,10 @@
           <w:lang w:val="es-CR"/>
         </w:rPr>
         <w:drawing>
-          <wp:inline distT="0" distB="0" distL="0" distR="0" wp14:anchorId="3E511EF7" wp14:editId="45616869">
-            <wp:extent cx="6123940" cy="4572000"/>
-            <wp:effectExtent l="0" t="0" r="0" b="0"/>
-            <wp:docPr id="1306843263" name="Imagen 4"/>
+          <wp:inline distT="0" distB="0" distL="0" distR="0" wp14:anchorId="667CB5D2" wp14:editId="7A406DF3">
+            <wp:extent cx="6123940" cy="4317365"/>
+            <wp:effectExtent l="0" t="0" r="0" b="635"/>
+            <wp:docPr id="1777493931" name="Picture 9" descr="A screenshot of a computer&#10;&#10;AI-generated content may be incorrect."/>
             <wp:cNvGraphicFramePr>
               <a:graphicFrameLocks xmlns:a="http://schemas.openxmlformats.org/drawingml/2006/main" noChangeAspect="1"/>
             </wp:cNvGraphicFramePr>
@@ -14109,32 +14113,23 @@
               <a:graphicData uri="http://schemas.openxmlformats.org/drawingml/2006/picture">
                 <pic:pic xmlns:pic="http://schemas.openxmlformats.org/drawingml/2006/picture">
                   <pic:nvPicPr>
-                    <pic:cNvPr id="1306843263" name="Imagen 1306843263"/>
+                    <pic:cNvPr id="1777493931" name="Picture 9" descr="A screenshot of a computer&#10;&#10;AI-generated content may be incorrect."/>
                     <pic:cNvPicPr/>
                   </pic:nvPicPr>
-                  <pic:blipFill rotWithShape="1">
+                  <pic:blipFill>
                     <a:blip r:embed="rId16"/>
-                    <a:srcRect b="19328"/>
                     <a:stretch>
                       <a:fillRect/>
                     </a:stretch>
                   </pic:blipFill>
-                  <pic:spPr bwMode="auto">
+                  <pic:spPr>
                     <a:xfrm>
                       <a:off x="0" y="0"/>
-                      <a:ext cx="6123940" cy="4572000"/>
+                      <a:ext cx="6123940" cy="4317365"/>
                     </a:xfrm>
                     <a:prstGeom prst="rect">
                       <a:avLst/>
                     </a:prstGeom>
-                    <a:ln>
-                      <a:noFill/>
-                    </a:ln>
-                    <a:extLst>
-                      <a:ext uri="{53640926-AAD7-44D8-BBD7-CCE9431645EC}">
-                        <a14:shadowObscured xmlns:a14="http://schemas.microsoft.com/office/drawing/2010/main"/>
-                      </a:ext>
-                    </a:extLst>
                   </pic:spPr>
                 </pic:pic>
               </a:graphicData>
@@ -14321,7 +14316,7 @@
                 <w:sz w:val="20"/>
                 <w:lang w:val="es-CR"/>
               </w:rPr>
-              <w:t>Gestión de Choferes y Vehículos</w:t>
+              <w:t>Gestión de Choferes</w:t>
             </w:r>
           </w:p>
         </w:tc>
@@ -14341,7 +14336,7 @@
                 <w:sz w:val="20"/>
                 <w:lang w:val="es-CR"/>
               </w:rPr>
-              <w:t>Administra la información de choferes y vehículos.</w:t>
+              <w:t>Administra la información de choferes.</w:t>
             </w:r>
           </w:p>
         </w:tc>
@@ -14574,28 +14569,34 @@
                 <w:bCs w:val="0"/>
               </w:rPr>
             </w:pPr>
+            <w:proofErr w:type="spellStart"/>
             <w:r>
               <w:rPr>
                 <w:bCs w:val="0"/>
                 <w:sz w:val="20"/>
               </w:rPr>
-              <w:t xml:space="preserve">Publicador de </w:t>
-            </w:r>
-            <w:proofErr w:type="spellStart"/>
+              <w:t>API REST / Capa de Aplicación</w:t>
+            </w:r>
+            <w:proofErr w:type="spellEnd"/>
             <w:r>
               <w:rPr>
                 <w:bCs w:val="0"/>
                 <w:sz w:val="20"/>
               </w:rPr>
-              <w:t>Eventos</w:t>
-            </w:r>
-            <w:proofErr w:type="spellEnd"/>
+            </w:r>
+            <w:proofErr w:type="spellStart"/>
             <w:r>
               <w:rPr>
                 <w:bCs w:val="0"/>
                 <w:sz w:val="20"/>
               </w:rPr>
-              <w:t xml:space="preserve"> (Outbox)</w:t>
+            </w:r>
+            <w:proofErr w:type="spellEnd"/>
+            <w:r>
+              <w:rPr>
+                <w:bCs w:val="0"/>
+                <w:sz w:val="20"/>
+              </w:rPr>
             </w:r>
           </w:p>
         </w:tc>
@@ -14615,7 +14616,7 @@
                 <w:sz w:val="20"/>
                 <w:lang w:val="es-CR"/>
               </w:rPr>
-              <w:t xml:space="preserve">Publica eventos de negocio hacia el Bus de Eventos (patrón </w:t>
+              <w:t>Punto de entrada del servicio; recibe solicitudes autenticadas y el contexto del operador desde el API Gateway.</w:t>
             </w:r>
             <w:proofErr w:type="spellStart"/>
             <w:r>
@@ -14623,7 +14624,6 @@
                 <w:sz w:val="20"/>
                 <w:lang w:val="es-CR"/>
               </w:rPr>
-              <w:t>Transactional</w:t>
             </w:r>
             <w:proofErr w:type="spellEnd"/>
             <w:r>
@@ -14631,7 +14631,6 @@
                 <w:sz w:val="20"/>
                 <w:lang w:val="es-CR"/>
               </w:rPr>
-              <w:t xml:space="preserve"> </w:t>
             </w:r>
             <w:proofErr w:type="spellStart"/>
             <w:r>
@@ -14639,7 +14638,6 @@
                 <w:sz w:val="20"/>
                 <w:lang w:val="es-CR"/>
               </w:rPr>
-              <w:t>Outbox</w:t>
             </w:r>
             <w:proofErr w:type="spellEnd"/>
             <w:r>
@@ -14647,7 +14645,6 @@
                 <w:sz w:val="20"/>
                 <w:lang w:val="es-CR"/>
               </w:rPr>
-              <w:t>).</w:t>
             </w:r>
           </w:p>
         </w:tc>
@@ -14722,10 +14719,10 @@
           <w:lang w:val="es-CR"/>
         </w:rPr>
         <w:drawing>
-          <wp:inline distT="0" distB="0" distL="0" distR="0" wp14:anchorId="4F61D00E" wp14:editId="5532B652">
-            <wp:extent cx="6123940" cy="5045075"/>
-            <wp:effectExtent l="0" t="0" r="0" b="3175"/>
-            <wp:docPr id="393221293" name="Imagen 5"/>
+          <wp:inline distT="0" distB="0" distL="0" distR="0" wp14:anchorId="5A830B51" wp14:editId="2A7DBDA6">
+            <wp:extent cx="6123940" cy="4866640"/>
+            <wp:effectExtent l="0" t="0" r="0" b="0"/>
+            <wp:docPr id="135929509" name="Picture 10" descr="A screenshot of a computer&#10;&#10;AI-generated content may be incorrect."/>
             <wp:cNvGraphicFramePr>
               <a:graphicFrameLocks xmlns:a="http://schemas.openxmlformats.org/drawingml/2006/main" noChangeAspect="1"/>
             </wp:cNvGraphicFramePr>
@@ -14733,7 +14730,7 @@
               <a:graphicData uri="http://schemas.openxmlformats.org/drawingml/2006/picture">
                 <pic:pic xmlns:pic="http://schemas.openxmlformats.org/drawingml/2006/picture">
                   <pic:nvPicPr>
-                    <pic:cNvPr id="393221293" name="Imagen 393221293"/>
+                    <pic:cNvPr id="135929509" name="Picture 10" descr="A screenshot of a computer&#10;&#10;AI-generated content may be incorrect."/>
                     <pic:cNvPicPr/>
                   </pic:nvPicPr>
                   <pic:blipFill>
@@ -14745,7 +14742,7 @@
                   <pic:spPr>
                     <a:xfrm>
                       <a:off x="0" y="0"/>
-                      <a:ext cx="6123940" cy="5045075"/>
+                      <a:ext cx="6123940" cy="4866640"/>
                     </a:xfrm>
                     <a:prstGeom prst="rect">
                       <a:avLst/>
@@ -15150,28 +15147,34 @@
                 <w:bCs w:val="0"/>
               </w:rPr>
             </w:pPr>
+            <w:proofErr w:type="spellStart"/>
             <w:r>
               <w:rPr>
                 <w:bCs w:val="0"/>
                 <w:sz w:val="20"/>
               </w:rPr>
-              <w:t xml:space="preserve">Publicador de </w:t>
-            </w:r>
-            <w:proofErr w:type="spellStart"/>
+              <w:t>Publicador de Eventos</w:t>
+            </w:r>
+            <w:proofErr w:type="spellEnd"/>
             <w:r>
               <w:rPr>
                 <w:bCs w:val="0"/>
                 <w:sz w:val="20"/>
               </w:rPr>
-              <w:t>Eventos</w:t>
-            </w:r>
-            <w:proofErr w:type="spellEnd"/>
+            </w:r>
+            <w:proofErr w:type="spellStart"/>
             <w:r>
               <w:rPr>
                 <w:bCs w:val="0"/>
                 <w:sz w:val="20"/>
               </w:rPr>
-              <w:t xml:space="preserve"> (Outbox)</w:t>
+            </w:r>
+            <w:proofErr w:type="spellEnd"/>
+            <w:r>
+              <w:rPr>
+                <w:bCs w:val="0"/>
+                <w:sz w:val="20"/>
+              </w:rPr>
             </w:r>
           </w:p>
         </w:tc>
@@ -15191,7 +15194,29 @@
                 <w:sz w:val="20"/>
                 <w:lang w:val="es-CR"/>
               </w:rPr>
-              <w:t>Publica eventos operativos (abordajes, entregas, incidentes) al Bus de Eventos.</w:t>
+              <w:t>Publica eventos operativos de abordaje, entrega, solicitud e incidente al Bus de Eventos.</w:t>
+            </w:r>
+          </w:p>
+        </w:tc>
+      </w:tr>
+      <w:tr>
+        <w:tc>
+          <w:tcPr>
+            <w:tcW w:type="dxa" w:w="4822"/>
+          </w:tcPr>
+          <w:p>
+            <w:r>
+              <w:t>API REST / Capa de Aplicación</w:t>
+            </w:r>
+          </w:p>
+        </w:tc>
+        <w:tc>
+          <w:tcPr>
+            <w:tcW w:type="dxa" w:w="4822"/>
+          </w:tcPr>
+          <w:p>
+            <w:r>
+              <w:t>Punto de entrada del servicio; recibe solicitudes autenticadas y el contexto del operador desde el API Gateway.</w:t>
             </w:r>
           </w:p>
         </w:tc>
@@ -15264,10 +15289,10 @@
           <w:lang w:val="es-CR"/>
         </w:rPr>
         <w:drawing>
-          <wp:inline distT="0" distB="0" distL="0" distR="0" wp14:anchorId="4D6DFCE2" wp14:editId="4E5AD823">
-            <wp:extent cx="6123940" cy="4125595"/>
-            <wp:effectExtent l="0" t="0" r="0" b="8255"/>
-            <wp:docPr id="100121414" name="Imagen 6"/>
+          <wp:inline distT="0" distB="0" distL="0" distR="0" wp14:anchorId="0E2CABAC" wp14:editId="6E1578A0">
+            <wp:extent cx="6123940" cy="5041900"/>
+            <wp:effectExtent l="0" t="0" r="0" b="0"/>
+            <wp:docPr id="461052834" name="Picture 11" descr="A screenshot of a computer&#10;&#10;AI-generated content may be incorrect."/>
             <wp:cNvGraphicFramePr>
               <a:graphicFrameLocks xmlns:a="http://schemas.openxmlformats.org/drawingml/2006/main" noChangeAspect="1"/>
             </wp:cNvGraphicFramePr>
@@ -15275,7 +15300,7 @@
               <a:graphicData uri="http://schemas.openxmlformats.org/drawingml/2006/picture">
                 <pic:pic xmlns:pic="http://schemas.openxmlformats.org/drawingml/2006/picture">
                   <pic:nvPicPr>
-                    <pic:cNvPr id="100121414" name="Imagen 100121414"/>
+                    <pic:cNvPr id="461052834" name="Picture 11" descr="A screenshot of a computer&#10;&#10;AI-generated content may be incorrect."/>
                     <pic:cNvPicPr/>
                   </pic:nvPicPr>
                   <pic:blipFill>
@@ -15287,7 +15312,7 @@
                   <pic:spPr>
                     <a:xfrm>
                       <a:off x="0" y="0"/>
-                      <a:ext cx="6123940" cy="4125595"/>
+                      <a:ext cx="6123940" cy="5041900"/>
                     </a:xfrm>
                     <a:prstGeom prst="rect">
                       <a:avLst/>
@@ -15364,19 +15389,28 @@
                 <w:bCs w:val="0"/>
               </w:rPr>
             </w:pPr>
+            <w:proofErr w:type="spellStart"/>
             <w:r>
               <w:rPr>
                 <w:bCs w:val="0"/>
                 <w:sz w:val="20"/>
               </w:rPr>
-              <w:t xml:space="preserve">Consumidor de </w:t>
-            </w:r>
-            <w:proofErr w:type="spellStart"/>
+              <w:t>Consumidor</w:t>
+            </w:r>
+            <w:proofErr w:type="spellEnd"/>
             <w:r>
               <w:rPr>
                 <w:bCs w:val="0"/>
                 <w:sz w:val="20"/>
               </w:rPr>
+              <w:t xml:space="preserve"> de </w:t>
+            </w:r>
+            <w:proofErr w:type="spellStart"/>
+            <w:r>
+              <w:rPr>
+                <w:bCs w:val="0"/>
+                <w:sz w:val="20"/>
+              </w:rPr>
               <w:t>Eventos</w:t>
             </w:r>
             <w:proofErr w:type="spellEnd"/>
@@ -15398,7 +15432,7 @@
                 <w:sz w:val="20"/>
                 <w:lang w:val="es-CR"/>
               </w:rPr>
-              <w:t>Consume eventos del Bus de Eventos relacionados con notificaciones.</w:t>
+              <w:t>Consume eventos del Bus de Eventos para notificación y registra los eventos operativos para auditoría.</w:t>
             </w:r>
           </w:p>
         </w:tc>
@@ -15568,7 +15602,7 @@
                 <w:sz w:val="20"/>
                 <w:lang w:val="es-CR"/>
               </w:rPr>
-              <w:t>Registro de Estado de Envío</w:t>
+              <w:t>Registro de Auditoría y Estado de Envío</w:t>
             </w:r>
           </w:p>
         </w:tc>
@@ -15588,7 +15622,7 @@
                 <w:sz w:val="20"/>
                 <w:lang w:val="es-CR"/>
               </w:rPr>
-              <w:t>Registra el estado de envío de cada notificación.</w:t>
+              <w:t>Registra de forma inmutable los eventos operativos y el estado de envío de las notificaciones.</w:t>
             </w:r>
           </w:p>
         </w:tc>
@@ -15655,7 +15689,6 @@
         <w:rPr>
           <w:lang w:val="es-CR"/>
         </w:rPr>
-        <w:lastRenderedPageBreak/>
         <w:t>5.</w:t>
       </w:r>
       <w:r>
@@ -15702,7 +15735,21 @@
         <w:rPr>
           <w:lang w:val="es-CR"/>
         </w:rPr>
-        <w:t xml:space="preserve"> siguen una convención interna de capas para mantener consistencia en el código: Controller → Service → </w:t>
+        <w:t xml:space="preserve"> siguen una convención interna de capas para mantener consistencia en el código: Controller → </w:t>
+      </w:r>
+      <w:proofErr w:type="spellStart"/>
+      <w:r>
+        <w:rPr>
+          <w:lang w:val="es-CR"/>
+        </w:rPr>
+        <w:t>Service</w:t>
+      </w:r>
+      <w:proofErr w:type="spellEnd"/>
+      <w:r>
+        <w:rPr>
+          <w:lang w:val="es-CR"/>
+        </w:rPr>
+        <w:t xml:space="preserve"> → </w:t>
       </w:r>
       <w:proofErr w:type="spellStart"/>
       <w:r>
@@ -17909,17 +17956,8 @@
                 <w:bCs w:val="0"/>
                 <w:sz w:val="20"/>
               </w:rPr>
-              <w:t xml:space="preserve"> </w:t>
-            </w:r>
-            <w:proofErr w:type="spellStart"/>
-            <w:r>
-              <w:rPr>
-                <w:bCs w:val="0"/>
-                <w:sz w:val="20"/>
-              </w:rPr>
-              <w:t>Médicos</w:t>
-            </w:r>
-            <w:proofErr w:type="spellEnd"/>
+              <w:t xml:space="preserve"> Médicos</w:t>
+            </w:r>
           </w:p>
         </w:tc>
         <w:tc>
@@ -18008,12 +18046,21 @@
                 <w:bCs w:val="0"/>
               </w:rPr>
             </w:pPr>
+            <w:proofErr w:type="spellStart"/>
             <w:r>
               <w:rPr>
                 <w:bCs w:val="0"/>
                 <w:sz w:val="20"/>
               </w:rPr>
-              <w:t xml:space="preserve">Publicador de </w:t>
+              <w:t>Publicador</w:t>
+            </w:r>
+            <w:proofErr w:type="spellEnd"/>
+            <w:r>
+              <w:rPr>
+                <w:bCs w:val="0"/>
+                <w:sz w:val="20"/>
+              </w:rPr>
+              <w:t xml:space="preserve"> de </w:t>
             </w:r>
             <w:proofErr w:type="spellStart"/>
             <w:r>
@@ -18585,17 +18632,8 @@
                 <w:b w:val="0"/>
                 <w:sz w:val="20"/>
               </w:rPr>
-              <w:t xml:space="preserve"> </w:t>
-            </w:r>
-            <w:proofErr w:type="spellStart"/>
-            <w:r>
-              <w:rPr>
-                <w:b w:val="0"/>
-                <w:sz w:val="20"/>
-              </w:rPr>
-              <w:t>Médicos</w:t>
-            </w:r>
-            <w:proofErr w:type="spellEnd"/>
+              <w:t xml:space="preserve"> Médicos</w:t>
+            </w:r>
           </w:p>
         </w:tc>
         <w:tc>
@@ -18672,12 +18710,21 @@
             <w:tcW w:w="2660" w:type="dxa"/>
           </w:tcPr>
           <w:p>
+            <w:proofErr w:type="spellStart"/>
             <w:r>
               <w:rPr>
                 <w:b w:val="0"/>
                 <w:sz w:val="20"/>
               </w:rPr>
-              <w:t xml:space="preserve">Publicador de </w:t>
+              <w:t>Publicador</w:t>
+            </w:r>
+            <w:proofErr w:type="spellEnd"/>
+            <w:r>
+              <w:rPr>
+                <w:b w:val="0"/>
+                <w:sz w:val="20"/>
+              </w:rPr>
+              <w:t xml:space="preserve"> de </w:t>
             </w:r>
             <w:proofErr w:type="spellStart"/>
             <w:r>
@@ -18995,12 +19042,21 @@
                 <w:bCs w:val="0"/>
               </w:rPr>
             </w:pPr>
+            <w:proofErr w:type="spellStart"/>
             <w:r>
               <w:rPr>
                 <w:bCs w:val="0"/>
                 <w:sz w:val="20"/>
               </w:rPr>
-              <w:t xml:space="preserve">Consumidor de </w:t>
+              <w:t>Consumidor</w:t>
+            </w:r>
+            <w:proofErr w:type="spellEnd"/>
+            <w:r>
+              <w:rPr>
+                <w:bCs w:val="0"/>
+                <w:sz w:val="20"/>
+              </w:rPr>
+              <w:t xml:space="preserve"> de </w:t>
             </w:r>
             <w:proofErr w:type="spellStart"/>
             <w:r>
@@ -19377,95 +19433,81 @@
         <w:rPr>
           <w:lang w:val="es-US"/>
         </w:rPr>
-        <w:t xml:space="preserve">El escenario permite que un </w:t>
-      </w:r>
-      <w:r>
-        <w:rPr>
-          <w:lang w:val="es-US"/>
-        </w:rPr>
-        <w:t>administrador</w:t>
-      </w:r>
-      <w:r>
-        <w:rPr>
-          <w:lang w:val="es-US"/>
-        </w:rPr>
-        <w:t xml:space="preserve">, </w:t>
-      </w:r>
-      <w:r>
-        <w:rPr>
-          <w:lang w:val="es-US"/>
-        </w:rPr>
-        <w:t>chofer</w:t>
-      </w:r>
-      <w:r>
-        <w:rPr>
-          <w:lang w:val="es-US"/>
-        </w:rPr>
-        <w:t xml:space="preserve"> o </w:t>
-      </w:r>
-      <w:r>
-        <w:rPr>
-          <w:lang w:val="es-US"/>
-        </w:rPr>
-        <w:t>cliente</w:t>
-      </w:r>
-      <w:r>
-        <w:rPr>
-          <w:lang w:val="es-US"/>
-        </w:rPr>
-        <w:t xml:space="preserve"> acceda a </w:t>
+        <w:t>El escenario permite que un administrador, chofer o cliente acceda a Movix mediante el flujo aprobado API Gateway → Servicio Principal → Proveedor de Identidad y que cada solicitud se ejecute en el operador correspondiente. El contexto del operador se obtiene a partir de la identidad autenticada y no se acepta únicamente como un valor enviado por la aplicación cliente. El API Gateway delega al Servicio Principal la validación del token y la resolución del contexto; el microservicio de destino vuelve a verificar el rol, la autorización y el operator_id antes de acceder a los datos.</w:t>
+      </w:r>
+      <w:r>
+        <w:rPr>
+          <w:lang w:val="es-US"/>
+        </w:rPr>
+      </w:r>
+      <w:r>
+        <w:rPr>
+          <w:lang w:val="es-US"/>
+        </w:rPr>
+      </w:r>
+      <w:r>
+        <w:rPr>
+          <w:lang w:val="es-US"/>
+        </w:rPr>
+      </w:r>
+      <w:r>
+        <w:rPr>
+          <w:lang w:val="es-US"/>
+        </w:rPr>
+      </w:r>
+      <w:r>
+        <w:rPr>
+          <w:lang w:val="es-US"/>
+        </w:rPr>
+      </w:r>
+      <w:r>
+        <w:rPr>
+          <w:lang w:val="es-US"/>
+        </w:rPr>
       </w:r>
       <w:proofErr w:type="spellStart"/>
       <w:r>
         <w:rPr>
           <w:lang w:val="es-US"/>
         </w:rPr>
-        <w:t>Movix</w:t>
       </w:r>
       <w:proofErr w:type="spellEnd"/>
       <w:r>
         <w:rPr>
           <w:lang w:val="es-US"/>
         </w:rPr>
-        <w:t xml:space="preserve"> mediante un proveedor externo de identidad y que cada solicitud </w:t>
-      </w:r>
-      <w:r>
-        <w:rPr>
-          <w:lang w:val="es-US"/>
-        </w:rPr>
-        <w:t>se ejecute en el</w:t>
-      </w:r>
-      <w:r>
-        <w:rPr>
-          <w:lang w:val="es-US"/>
-        </w:rPr>
-        <w:t xml:space="preserve"> operador </w:t>
-      </w:r>
-      <w:r>
-        <w:rPr>
-          <w:lang w:val="es-US"/>
-        </w:rPr>
-        <w:t>correspondiente</w:t>
-      </w:r>
-      <w:r>
-        <w:rPr>
-          <w:lang w:val="es-US"/>
-        </w:rPr>
-        <w:t xml:space="preserve">. El contexto del operador se obtiene a partir de la identidad autenticada y no se acepta únicamente como un valor enviado por la aplicación cliente. El API Gateway realiza la validación inicial y el microservicio de destino vuelve a verificar el rol, la autorización y el </w:t>
+      </w:r>
+      <w:r>
+        <w:rPr>
+          <w:lang w:val="es-US"/>
+        </w:rPr>
+      </w:r>
+      <w:r>
+        <w:rPr>
+          <w:lang w:val="es-US"/>
+        </w:rPr>
+      </w:r>
+      <w:r>
+        <w:rPr>
+          <w:lang w:val="es-US"/>
+        </w:rPr>
+      </w:r>
+      <w:r>
+        <w:rPr>
+          <w:lang w:val="es-US"/>
+        </w:rPr>
       </w:r>
       <w:proofErr w:type="spellStart"/>
       <w:r>
         <w:rPr>
           <w:lang w:val="es-US"/>
         </w:rPr>
-        <w:t>operator_id</w:t>
       </w:r>
       <w:proofErr w:type="spellEnd"/>
       <w:r>
         <w:rPr>
           <w:lang w:val="es-US"/>
         </w:rPr>
-        <w:t xml:space="preserve"> antes de acceder a los datos.</w:t>
       </w:r>
     </w:p>
     <w:p>
@@ -19667,25 +19709,22 @@
           <w:b/>
           <w:lang w:val="es-US"/>
         </w:rPr>
-        <w:t xml:space="preserve">2. </w:t>
-      </w:r>
-      <w:r>
-        <w:rPr>
-          <w:lang w:val="es-US"/>
-        </w:rPr>
-        <w:t>La aplicación utiliza el flujo del proveedor externo de identidad, que autentica al usuario y emite un</w:t>
-      </w:r>
-      <w:r>
-        <w:rPr>
-          <w:lang w:val="es-US"/>
-        </w:rPr>
-        <w:t xml:space="preserve"> </w:t>
-      </w:r>
-      <w:r>
-        <w:rPr>
-          <w:lang w:val="es-US"/>
-        </w:rPr>
-        <w:t>token firmado.</w:t>
+        <w:t>2. La aplicación inicia la autenticación mediante el API Gateway; este delega al Servicio Principal la validación de la identidad y la resolución del contexto con el proveedor externo.</w:t>
+      </w:r>
+      <w:r>
+        <w:rPr>
+          <w:lang w:val="es-US"/>
+        </w:rPr>
+      </w:r>
+      <w:r>
+        <w:rPr>
+          <w:lang w:val="es-US"/>
+        </w:rPr>
+      </w:r>
+      <w:r>
+        <w:rPr>
+          <w:lang w:val="es-US"/>
+        </w:rPr>
       </w:r>
     </w:p>
     <w:p>
@@ -19723,26 +19762,22 @@
           <w:b/>
           <w:lang w:val="es-US"/>
         </w:rPr>
-        <w:lastRenderedPageBreak/>
-        <w:t xml:space="preserve">4. </w:t>
-      </w:r>
-      <w:r>
-        <w:rPr>
-          <w:lang w:val="es-US"/>
-        </w:rPr>
-        <w:t xml:space="preserve">El Autorizador Personalizado verifica el token y construye el contexto </w:t>
-      </w:r>
-      <w:r>
-        <w:rPr>
-          <w:lang w:val="es-US"/>
-        </w:rPr>
-        <w:t>del usuario, el rol y el</w:t>
-      </w:r>
-      <w:r>
-        <w:rPr>
-          <w:lang w:val="es-US"/>
-        </w:rPr>
-        <w:t xml:space="preserve"> operador.</w:t>
+        <w:t>4. El Autorizador de Acceso del API Gateway delega al Servicio Principal la validación del token y la resolución del contexto de usuario, rol y operador.</w:t>
+      </w:r>
+      <w:r>
+        <w:rPr>
+          <w:lang w:val="es-US"/>
+        </w:rPr>
+      </w:r>
+      <w:r>
+        <w:rPr>
+          <w:lang w:val="es-US"/>
+        </w:rPr>
+      </w:r>
+      <w:r>
+        <w:rPr>
+          <w:lang w:val="es-US"/>
+        </w:rPr>
       </w:r>
     </w:p>
     <w:p>
@@ -20612,7 +20647,25 @@
                 <w:color w:val="FFFFFF"/>
                 <w:sz w:val="17"/>
               </w:rPr>
-              <w:t xml:space="preserve"> el </w:t>
+              <w:t xml:space="preserve"> </w:t>
+            </w:r>
+            <w:proofErr w:type="spellStart"/>
+            <w:r>
+              <w:rPr>
+                <w:b/>
+                <w:color w:val="FFFFFF"/>
+                <w:sz w:val="17"/>
+              </w:rPr>
+              <w:t>el</w:t>
+            </w:r>
+            <w:proofErr w:type="spellEnd"/>
+            <w:r>
+              <w:rPr>
+                <w:b/>
+                <w:color w:val="FFFFFF"/>
+                <w:sz w:val="17"/>
+              </w:rPr>
+              <w:t xml:space="preserve"> </w:t>
             </w:r>
             <w:proofErr w:type="spellStart"/>
             <w:r>
@@ -20710,7 +20763,7 @@
                 <w:sz w:val="17"/>
                 <w:lang w:val="es-US"/>
               </w:rPr>
-              <w:t>La autorización se realiza en el API Gateway y se repite en cada microservicio.</w:t>
+              <w:t>El API Gateway delega la validación al Servicio Principal y cada microservicio verifica rol, autorización y operator_id.</w:t>
             </w:r>
           </w:p>
         </w:tc>
@@ -21192,14 +21245,14 @@
         <w:rPr>
           <w:lang w:val="es-CR"/>
         </w:rPr>
-        <w:t xml:space="preserve">concepto transversal. Permanecen pendientes de documentar otros conceptos transversales relevantes para la arquitectura, tales como seguridad, </w:t>
+        <w:t>concepto transversal. Permanecen pendientes de documentar otros conceptos transversales relevantes para la arquitectura, tales como seguridad, multi-</w:t>
       </w:r>
       <w:proofErr w:type="spellStart"/>
       <w:r>
         <w:rPr>
           <w:lang w:val="es-CR"/>
         </w:rPr>
-        <w:t>multi-tenancy</w:t>
+        <w:t>tenancy</w:t>
       </w:r>
       <w:proofErr w:type="spellEnd"/>
       <w:r>
@@ -21620,83 +21673,72 @@
                 <w:szCs w:val="21"/>
                 <w:lang w:val="es-US"/>
               </w:rPr>
-              <w:t xml:space="preserve">Operadores, usuarios y roles de aplicación, choferes, pasajeros, vehículos, perfiles médicos o veterinarios y configuraciones. </w:t>
+              <w:t>Operadores, usuarios y roles de aplicación, choferes, pasajeros, perfiles médicos o veterinarios y configuraciones. No almacena credenciales del proveedor externo de identidad.</w:t>
             </w:r>
             <w:r>
               <w:rPr>
                 <w:szCs w:val="21"/>
               </w:rPr>
-              <w:t xml:space="preserve">No </w:t>
             </w:r>
             <w:proofErr w:type="spellStart"/>
             <w:r>
               <w:rPr>
                 <w:szCs w:val="21"/>
               </w:rPr>
-              <w:t>almacena</w:t>
             </w:r>
             <w:proofErr w:type="spellEnd"/>
             <w:r>
               <w:rPr>
                 <w:szCs w:val="21"/>
               </w:rPr>
-              <w:t xml:space="preserve"> </w:t>
             </w:r>
             <w:proofErr w:type="spellStart"/>
             <w:r>
               <w:rPr>
                 <w:szCs w:val="21"/>
               </w:rPr>
-              <w:t>credenciales</w:t>
             </w:r>
             <w:proofErr w:type="spellEnd"/>
             <w:r>
               <w:rPr>
                 <w:szCs w:val="21"/>
               </w:rPr>
-              <w:t xml:space="preserve"> del </w:t>
             </w:r>
             <w:proofErr w:type="spellStart"/>
             <w:r>
               <w:rPr>
                 <w:szCs w:val="21"/>
               </w:rPr>
-              <w:t>proveedor</w:t>
             </w:r>
             <w:proofErr w:type="spellEnd"/>
             <w:r>
               <w:rPr>
                 <w:szCs w:val="21"/>
               </w:rPr>
-              <w:t xml:space="preserve"> </w:t>
             </w:r>
             <w:proofErr w:type="spellStart"/>
             <w:r>
               <w:rPr>
                 <w:szCs w:val="21"/>
               </w:rPr>
-              <w:t>externo</w:t>
             </w:r>
             <w:proofErr w:type="spellEnd"/>
             <w:r>
               <w:rPr>
                 <w:szCs w:val="21"/>
               </w:rPr>
-              <w:t xml:space="preserve"> de </w:t>
             </w:r>
             <w:proofErr w:type="spellStart"/>
             <w:r>
               <w:rPr>
                 <w:szCs w:val="21"/>
               </w:rPr>
-              <w:t>identidad</w:t>
             </w:r>
             <w:proofErr w:type="spellEnd"/>
             <w:r>
               <w:rPr>
                 <w:szCs w:val="21"/>
               </w:rPr>
-              <w:t>.</w:t>
             </w:r>
           </w:p>
         </w:tc>
@@ -21714,11 +21756,19 @@
                 <w:szCs w:val="21"/>
               </w:rPr>
             </w:pPr>
+            <w:proofErr w:type="spellStart"/>
             <w:r>
               <w:rPr>
                 <w:szCs w:val="21"/>
               </w:rPr>
-              <w:t xml:space="preserve">Servicio de </w:t>
+              <w:t>Servicio</w:t>
+            </w:r>
+            <w:proofErr w:type="spellEnd"/>
+            <w:r>
+              <w:rPr>
+                <w:szCs w:val="21"/>
+              </w:rPr>
+              <w:t xml:space="preserve"> de </w:t>
             </w:r>
             <w:proofErr w:type="spellStart"/>
             <w:r>
@@ -21794,7 +21844,7 @@
               <w:rPr>
                 <w:szCs w:val="21"/>
               </w:rPr>
-              <w:t>Auditoría</w:t>
+              <w:t>Servicio de Interacción</w:t>
             </w:r>
             <w:proofErr w:type="spellEnd"/>
           </w:p>
@@ -21845,63 +21895,55 @@
                 <w:szCs w:val="21"/>
                 <w:lang w:val="es-US"/>
               </w:rPr>
-              <w:t xml:space="preserve">Registro histórico de eventos y acciones relevantes para </w:t>
+              <w:t>Bitácora de auditoría y estado de envío de notificaciones.</w:t>
             </w:r>
             <w:r>
               <w:rPr>
                 <w:szCs w:val="21"/>
                 <w:lang w:val="es-US"/>
               </w:rPr>
-              <w:t xml:space="preserve">la </w:t>
             </w:r>
             <w:r>
               <w:rPr>
                 <w:szCs w:val="21"/>
                 <w:lang w:val="es-US"/>
               </w:rPr>
-              <w:t xml:space="preserve">trazabilidad. Debe </w:t>
             </w:r>
             <w:r>
               <w:rPr>
                 <w:szCs w:val="21"/>
                 <w:lang w:val="es-US"/>
               </w:rPr>
-              <w:t>considerarse</w:t>
             </w:r>
             <w:r>
               <w:rPr>
                 <w:szCs w:val="21"/>
                 <w:lang w:val="es-US"/>
               </w:rPr>
-              <w:t xml:space="preserve"> </w:t>
             </w:r>
             <w:r>
               <w:rPr>
                 <w:szCs w:val="21"/>
                 <w:lang w:val="es-US"/>
               </w:rPr>
-              <w:t xml:space="preserve">un </w:t>
             </w:r>
             <w:r>
               <w:rPr>
                 <w:szCs w:val="21"/>
                 <w:lang w:val="es-US"/>
               </w:rPr>
-              <w:t xml:space="preserve">repositorio de </w:t>
             </w:r>
             <w:r>
               <w:rPr>
                 <w:szCs w:val="21"/>
                 <w:lang w:val="es-US"/>
               </w:rPr>
-              <w:t>anexos únicamente</w:t>
             </w:r>
             <w:r>
               <w:rPr>
                 <w:szCs w:val="21"/>
                 <w:lang w:val="es-US"/>
               </w:rPr>
-              <w:t xml:space="preserve"> desde la perspectiva funcional.</w:t>
             </w:r>
           </w:p>
         </w:tc>
@@ -22457,14 +22499,14 @@
         <w:rPr>
           <w:lang w:val="es-US"/>
         </w:rPr>
-        <w:t xml:space="preserve">Todo registro sujeto a </w:t>
+        <w:t>Todo registro sujeto a multi-</w:t>
       </w:r>
       <w:proofErr w:type="spellStart"/>
       <w:r>
         <w:rPr>
           <w:lang w:val="es-US"/>
         </w:rPr>
-        <w:t>multi-tenancy</w:t>
+        <w:t>tenancy</w:t>
       </w:r>
       <w:proofErr w:type="spellEnd"/>
       <w:r>
@@ -24601,7 +24643,7 @@
                 <w:szCs w:val="21"/>
                 <w:lang w:val="es-US"/>
               </w:rPr>
-              <w:t>Procesos como asignar una ruta, reservar chofer y vehículo y activar la operación mediante transacciones locales y compensaciones.</w:t>
+              <w:t>Propuesta diferida: cualquier coordinación futura entre Operaciones y Principal deberá aprobarse y representarse en C4 antes de implementarse.</w:t>
             </w:r>
           </w:p>
         </w:tc>
@@ -25184,31 +25226,27 @@
         <w:rPr>
           <w:lang w:val="es-US"/>
         </w:rPr>
-        <w:t xml:space="preserve">El Servicio de Operaciones actuará inicialmente como orquestador de las Sagas relacionadas con la planificación y </w:t>
-      </w:r>
-      <w:r>
-        <w:rPr>
-          <w:lang w:val="es-US"/>
-        </w:rPr>
-        <w:t>la ejecución de rutas, ya que</w:t>
-      </w:r>
-      <w:r>
-        <w:rPr>
-          <w:lang w:val="es-US"/>
-        </w:rPr>
-        <w:t xml:space="preserve"> es el propietario del proceso de ruta activa. No se propone un microservicio de orquestación independiente en la primera etapa</w:t>
-      </w:r>
-      <w:r>
-        <w:rPr>
-          <w:lang w:val="es-US"/>
-        </w:rPr>
-        <w:t xml:space="preserve"> para</w:t>
-      </w:r>
-      <w:r>
-        <w:rPr>
-          <w:lang w:val="es-US"/>
-        </w:rPr>
-        <w:t xml:space="preserve"> evitar infraestructura y complejidad innecesarias.</w:t>
+        <w:t>El C4 vigente no define una comunicación directa entre el Servicio de Operaciones y el Servicio Principal para orquestar Sagas. Cualquier Saga futura relacionada con la planificación y ejecución de rutas deberá aprobarse explícitamente y reflejarse primero en los niveles C4 correspondientes; no se propone un microservicio de orquestación independiente en la primera etapa.</w:t>
+      </w:r>
+      <w:r>
+        <w:rPr>
+          <w:lang w:val="es-US"/>
+        </w:rPr>
+      </w:r>
+      <w:r>
+        <w:rPr>
+          <w:lang w:val="es-US"/>
+        </w:rPr>
+      </w:r>
+      <w:r>
+        <w:rPr>
+          <w:lang w:val="es-US"/>
+        </w:rPr>
+      </w:r>
+      <w:r>
+        <w:rPr>
+          <w:lang w:val="es-US"/>
+        </w:rPr>
       </w:r>
     </w:p>
     <w:p>
@@ -25222,13 +25260,12 @@
           <w:b/>
           <w:lang w:val="es-US"/>
         </w:rPr>
-        <w:t>Caso principal:</w:t>
-      </w:r>
-      <w:r>
-        <w:rPr>
-          <w:lang w:val="es-US"/>
-        </w:rPr>
-        <w:t xml:space="preserve"> asignación y activación de una ruta</w:t>
+        <w:t>Propuesta diferida: asignación y activación de una ruta (no forma parte del C4 vigente)</w:t>
+      </w:r>
+      <w:r>
+        <w:rPr>
+          <w:lang w:val="es-US"/>
+        </w:rPr>
       </w:r>
     </w:p>
     <w:p>
@@ -25266,25 +25303,22 @@
           <w:b/>
           <w:lang w:val="es-US"/>
         </w:rPr>
-        <w:t xml:space="preserve">2. Reservar recursos: </w:t>
-      </w:r>
-      <w:r>
-        <w:rPr>
-          <w:lang w:val="es-US"/>
-        </w:rPr>
-        <w:t xml:space="preserve">Solicita al Servicio Principal </w:t>
-      </w:r>
-      <w:r>
-        <w:rPr>
-          <w:lang w:val="es-US"/>
-        </w:rPr>
-        <w:t>que reserve</w:t>
-      </w:r>
-      <w:r>
-        <w:rPr>
-          <w:lang w:val="es-US"/>
-        </w:rPr>
-        <w:t xml:space="preserve"> el chofer y el vehículo. La transacción local registra una reserva temporal.</w:t>
+        <w:t>2. Reservar recursos: Si en el futuro se aprueba una coordinación con el Servicio Principal, se solicitará la reserva del chofer mediante un contrato explícito y la relación deberá incorporarse al C4.</w:t>
+      </w:r>
+      <w:r>
+        <w:rPr>
+          <w:lang w:val="es-US"/>
+        </w:rPr>
+      </w:r>
+      <w:r>
+        <w:rPr>
+          <w:lang w:val="es-US"/>
+        </w:rPr>
+      </w:r>
+      <w:r>
+        <w:rPr>
+          <w:lang w:val="es-US"/>
+        </w:rPr>
       </w:r>
     </w:p>
     <w:p>
@@ -25322,25 +25356,22 @@
           <w:b/>
           <w:lang w:val="es-US"/>
         </w:rPr>
-        <w:t xml:space="preserve">4. Confirmar la asignación: </w:t>
-      </w:r>
-      <w:r>
-        <w:rPr>
-          <w:lang w:val="es-US"/>
-        </w:rPr>
-        <w:t xml:space="preserve">El Servicio Principal convierte la reserva temporal en </w:t>
-      </w:r>
-      <w:r>
-        <w:rPr>
-          <w:lang w:val="es-US"/>
-        </w:rPr>
-        <w:t xml:space="preserve">una </w:t>
-      </w:r>
-      <w:r>
-        <w:rPr>
-          <w:lang w:val="es-US"/>
-        </w:rPr>
-        <w:t>asignación confirmada.</w:t>
+        <w:t>4. Confirmar la asignación: La coordinación futura deberá definir la confirmación y las compensaciones sin asumir relaciones no representadas en el C4 vigente.</w:t>
+      </w:r>
+      <w:r>
+        <w:rPr>
+          <w:lang w:val="es-US"/>
+        </w:rPr>
+      </w:r>
+      <w:r>
+        <w:rPr>
+          <w:lang w:val="es-US"/>
+        </w:rPr>
+      </w:r>
+      <w:r>
+        <w:rPr>
+          <w:lang w:val="es-US"/>
+        </w:rPr>
       </w:r>
     </w:p>
     <w:p>
@@ -25356,55 +25387,48 @@
           <w:b/>
           <w:lang w:val="es-US"/>
         </w:rPr>
-        <w:t xml:space="preserve">5. Publicar el resultado: </w:t>
-      </w:r>
-      <w:r>
-        <w:rPr>
-          <w:lang w:val="es-US"/>
-        </w:rPr>
-        <w:t xml:space="preserve">El Servicio de Operaciones publica </w:t>
+        <w:t>5. Publicar el resultado: El Servicio de Operaciones publica, cuando corresponda, los eventos operativos declarados en C4 —abordaje, entrega, solicitud e incidente—; Interacción los consume de forma asíncrona para notificación y auditoría.</w:t>
+      </w:r>
+      <w:r>
+        <w:rPr>
+          <w:lang w:val="es-US"/>
+        </w:rPr>
       </w:r>
       <w:proofErr w:type="spellStart"/>
       <w:r>
         <w:rPr>
           <w:lang w:val="es-US"/>
         </w:rPr>
-        <w:t>RouteActivated</w:t>
       </w:r>
       <w:proofErr w:type="spellEnd"/>
       <w:r>
         <w:rPr>
           <w:lang w:val="es-US"/>
         </w:rPr>
-        <w:t xml:space="preserve"> mediante </w:t>
       </w:r>
       <w:proofErr w:type="spellStart"/>
       <w:r>
         <w:rPr>
           <w:lang w:val="es-US"/>
         </w:rPr>
-        <w:t>Transactional</w:t>
       </w:r>
       <w:proofErr w:type="spellEnd"/>
       <w:r>
         <w:rPr>
           <w:lang w:val="es-US"/>
         </w:rPr>
-        <w:t xml:space="preserve"> </w:t>
       </w:r>
       <w:proofErr w:type="spellStart"/>
       <w:r>
         <w:rPr>
           <w:lang w:val="es-US"/>
         </w:rPr>
-        <w:t>Outbox</w:t>
       </w:r>
       <w:proofErr w:type="spellEnd"/>
       <w:r>
         <w:rPr>
           <w:lang w:val="es-US"/>
         </w:rPr>
-        <w:t>; Interacción y Auditoría reaccionan de forma asíncrona.</w:t>
       </w:r>
     </w:p>
     <w:p>
@@ -25443,19 +25467,17 @@
         <w:rPr>
           <w:lang w:val="es-US"/>
         </w:rPr>
-        <w:t xml:space="preserve">Si la creación de la ruta falla </w:t>
-      </w:r>
-      <w:r>
-        <w:rPr>
-          <w:lang w:val="es-US"/>
-        </w:rPr>
-        <w:t>tras</w:t>
-      </w:r>
-      <w:r>
-        <w:rPr>
-          <w:lang w:val="es-US"/>
-        </w:rPr>
-        <w:t xml:space="preserve"> reservar los recursos, el orquestador solicita liberar la reserva del chofer y del vehículo.</w:t>
+        <w:t>Si una futura coordinación de recursos falla tras reservar el chofer, el orquestador deberá solicitar la liberación conforme al contrato que se apruebe.</w:t>
+      </w:r>
+      <w:r>
+        <w:rPr>
+          <w:lang w:val="es-US"/>
+        </w:rPr>
+      </w:r>
+      <w:r>
+        <w:rPr>
+          <w:lang w:val="es-US"/>
+        </w:rPr>
       </w:r>
     </w:p>
     <w:p>
@@ -26410,111 +26432,95 @@
         <w:rPr>
           <w:lang w:val="es-US"/>
         </w:rPr>
-        <w:t xml:space="preserve">El patrón se aplicará especialmente a </w:t>
+        <w:t>El patrón se aplicará especialmente a los eventos de abordaje, entrega, solicitud e incidente que alimentan la auditoría o las notificaciones. El consumidor y el registro de auditoría del Servicio de Interacción deberán ser idempotentes, ya que Kafka puede entregar el mismo mensaje más de una vez.</w:t>
       </w:r>
       <w:proofErr w:type="spellStart"/>
       <w:r>
         <w:rPr>
           <w:lang w:val="es-US"/>
         </w:rPr>
-        <w:t>PassengerBoarded</w:t>
       </w:r>
       <w:proofErr w:type="spellEnd"/>
       <w:r>
         <w:rPr>
           <w:lang w:val="es-US"/>
         </w:rPr>
-        <w:t xml:space="preserve">, </w:t>
       </w:r>
       <w:proofErr w:type="spellStart"/>
       <w:r>
         <w:rPr>
           <w:lang w:val="es-US"/>
         </w:rPr>
-        <w:t>PassengerDelivered</w:t>
       </w:r>
       <w:proofErr w:type="spellEnd"/>
       <w:r>
         <w:rPr>
           <w:lang w:val="es-US"/>
         </w:rPr>
-        <w:t xml:space="preserve">, </w:t>
       </w:r>
       <w:proofErr w:type="spellStart"/>
       <w:r>
         <w:rPr>
           <w:lang w:val="es-US"/>
         </w:rPr>
-        <w:t>IncidentReported</w:t>
       </w:r>
       <w:proofErr w:type="spellEnd"/>
       <w:r>
         <w:rPr>
           <w:lang w:val="es-US"/>
         </w:rPr>
-        <w:t xml:space="preserve">, </w:t>
       </w:r>
       <w:proofErr w:type="spellStart"/>
       <w:r>
         <w:rPr>
           <w:lang w:val="es-US"/>
         </w:rPr>
-        <w:t>RouteStatusChanged</w:t>
       </w:r>
       <w:proofErr w:type="spellEnd"/>
       <w:r>
         <w:rPr>
           <w:lang w:val="es-US"/>
         </w:rPr>
-        <w:t xml:space="preserve"> y a los eventos que alimentan </w:t>
-      </w:r>
-      <w:r>
-        <w:rPr>
-          <w:lang w:val="es-US"/>
-        </w:rPr>
-        <w:t xml:space="preserve">la </w:t>
-      </w:r>
-      <w:r>
-        <w:rPr>
-          <w:lang w:val="es-US"/>
-        </w:rPr>
-        <w:t xml:space="preserve">auditoría o </w:t>
-      </w:r>
-      <w:r>
-        <w:rPr>
-          <w:lang w:val="es-US"/>
-        </w:rPr>
-        <w:t xml:space="preserve">las </w:t>
-      </w:r>
-      <w:r>
-        <w:rPr>
-          <w:lang w:val="es-US"/>
-        </w:rPr>
-        <w:t xml:space="preserve">notificaciones. Los consumidores del Servicio de Interacción y del repositorio de Auditoría deberán ser idempotentes, ya que Kafka puede entregar </w:t>
-      </w:r>
-      <w:r>
-        <w:rPr>
-          <w:lang w:val="es-US"/>
-        </w:rPr>
-        <w:t>el</w:t>
-      </w:r>
-      <w:r>
-        <w:rPr>
-          <w:lang w:val="es-US"/>
-        </w:rPr>
-        <w:t xml:space="preserve"> </w:t>
-      </w:r>
-      <w:r>
-        <w:rPr>
-          <w:lang w:val="es-US"/>
-        </w:rPr>
-        <w:t xml:space="preserve">mismo </w:t>
-      </w:r>
-      <w:r>
-        <w:rPr>
-          <w:lang w:val="es-US"/>
-        </w:rPr>
-        <w:t>mensaje más de una vez.</w:t>
+      </w:r>
+      <w:r>
+        <w:rPr>
+          <w:lang w:val="es-US"/>
+        </w:rPr>
+      </w:r>
+      <w:r>
+        <w:rPr>
+          <w:lang w:val="es-US"/>
+        </w:rPr>
+      </w:r>
+      <w:r>
+        <w:rPr>
+          <w:lang w:val="es-US"/>
+        </w:rPr>
+      </w:r>
+      <w:r>
+        <w:rPr>
+          <w:lang w:val="es-US"/>
+        </w:rPr>
+      </w:r>
+      <w:r>
+        <w:rPr>
+          <w:lang w:val="es-US"/>
+        </w:rPr>
+      </w:r>
+      <w:r>
+        <w:rPr>
+          <w:lang w:val="es-US"/>
+        </w:rPr>
+      </w:r>
+      <w:r>
+        <w:rPr>
+          <w:lang w:val="es-US"/>
+        </w:rPr>
+      </w:r>
+      <w:r>
+        <w:rPr>
+          <w:lang w:val="es-US"/>
+        </w:rPr>
       </w:r>
     </w:p>
     <w:p>
@@ -26712,7 +26718,6 @@
                 <w:szCs w:val="21"/>
               </w:rPr>
             </w:pPr>
-            <w:proofErr w:type="spellStart"/>
             <w:r>
               <w:rPr>
                 <w:color w:val="FFFFFF"/>
@@ -26720,7 +26725,6 @@
               </w:rPr>
               <w:t>Beneficio</w:t>
             </w:r>
-            <w:proofErr w:type="spellEnd"/>
           </w:p>
         </w:tc>
       </w:tr>
@@ -27725,12 +27729,21 @@
                 <w:szCs w:val="21"/>
               </w:rPr>
             </w:pPr>
+            <w:proofErr w:type="spellStart"/>
             <w:r>
               <w:rPr>
                 <w:b w:val="0"/>
                 <w:szCs w:val="21"/>
               </w:rPr>
-              <w:t xml:space="preserve">Servicio de </w:t>
+              <w:t>Servicio</w:t>
+            </w:r>
+            <w:proofErr w:type="spellEnd"/>
+            <w:r>
+              <w:rPr>
+                <w:b w:val="0"/>
+                <w:szCs w:val="21"/>
+              </w:rPr>
+              <w:t xml:space="preserve"> de </w:t>
             </w:r>
             <w:proofErr w:type="spellStart"/>
             <w:r>
@@ -28211,45 +28224,39 @@
         <w:rPr>
           <w:lang w:val="es-US"/>
         </w:rPr>
-        <w:t xml:space="preserve">El API Gateway continuará siendo el </w:t>
-      </w:r>
-      <w:r>
-        <w:rPr>
-          <w:lang w:val="es-US"/>
-        </w:rPr>
-        <w:t>único punto</w:t>
-      </w:r>
-      <w:r>
-        <w:rPr>
-          <w:lang w:val="es-US"/>
-        </w:rPr>
-        <w:t xml:space="preserve"> de entrada para las aplicaciones Web y Mobile. Aplicará autenticación, validación inicial del token, </w:t>
-      </w:r>
-      <w:r>
-        <w:rPr>
-          <w:lang w:val="es-US"/>
-        </w:rPr>
-        <w:t>limitación de tasas</w:t>
-      </w:r>
-      <w:r>
-        <w:rPr>
-          <w:lang w:val="es-US"/>
-        </w:rPr>
-        <w:t xml:space="preserve">, cuotas, enrutamiento, versionado de </w:t>
+        <w:t>El API Gateway continuará siendo el único punto de entrada para las aplicaciones Web y Mobile. Aplicará validación de solicitudes, limitación de tasas, cuotas, enrutamiento, versionado de APIs y propagación de identificadores de correlación. Mediante su Autorizador de Acceso delegará al Servicio Principal la validación del token y la resolución del contexto inicial del operador.</w:t>
+      </w:r>
+      <w:r>
+        <w:rPr>
+          <w:lang w:val="es-US"/>
+        </w:rPr>
+      </w:r>
+      <w:r>
+        <w:rPr>
+          <w:lang w:val="es-US"/>
+        </w:rPr>
+      </w:r>
+      <w:r>
+        <w:rPr>
+          <w:lang w:val="es-US"/>
+        </w:rPr>
+      </w:r>
+      <w:r>
+        <w:rPr>
+          <w:lang w:val="es-US"/>
+        </w:rPr>
       </w:r>
       <w:proofErr w:type="spellStart"/>
       <w:r>
         <w:rPr>
           <w:lang w:val="es-US"/>
         </w:rPr>
-        <w:t>APIs</w:t>
       </w:r>
       <w:proofErr w:type="spellEnd"/>
       <w:r>
         <w:rPr>
           <w:lang w:val="es-US"/>
         </w:rPr>
-        <w:t xml:space="preserve"> y propagación de identificadores de correlación. También resolverá el contexto inicial del operador a partir de la identidad autenticada.</w:t>
       </w:r>
     </w:p>
     <w:p>
@@ -28801,12 +28808,21 @@
                 <w:szCs w:val="21"/>
               </w:rPr>
             </w:pPr>
+            <w:proofErr w:type="spellStart"/>
             <w:r>
               <w:rPr>
                 <w:b w:val="0"/>
                 <w:szCs w:val="21"/>
               </w:rPr>
-              <w:t>Servicio Principal</w:t>
+              <w:t>Servicio</w:t>
+            </w:r>
+            <w:proofErr w:type="spellEnd"/>
+            <w:r>
+              <w:rPr>
+                <w:b w:val="0"/>
+                <w:szCs w:val="21"/>
+              </w:rPr>
+              <w:t xml:space="preserve"> Principal</w:t>
             </w:r>
           </w:p>
         </w:tc>
@@ -28828,7 +28844,7 @@
                 <w:szCs w:val="21"/>
                 <w:lang w:val="es-US"/>
               </w:rPr>
-              <w:t xml:space="preserve">Participante de Saga, transacciones locales, </w:t>
+              <w:t>Transacciones locales y Cache-Aside para datos de referencia; Gestión de Usuarios y Roles integra con el proveedor de identidad.</w:t>
             </w:r>
             <w:proofErr w:type="spellStart"/>
             <w:r>
@@ -28836,7 +28852,6 @@
                 <w:szCs w:val="21"/>
                 <w:lang w:val="es-US"/>
               </w:rPr>
-              <w:t>Transactional</w:t>
             </w:r>
             <w:proofErr w:type="spellEnd"/>
             <w:r>
@@ -28844,7 +28859,6 @@
                 <w:szCs w:val="21"/>
                 <w:lang w:val="es-US"/>
               </w:rPr>
-              <w:t xml:space="preserve"> </w:t>
             </w:r>
             <w:proofErr w:type="spellStart"/>
             <w:r>
@@ -28852,7 +28866,6 @@
                 <w:szCs w:val="21"/>
                 <w:lang w:val="es-US"/>
               </w:rPr>
-              <w:t>Outbox</w:t>
             </w:r>
             <w:proofErr w:type="spellEnd"/>
             <w:r>
@@ -28860,7 +28873,6 @@
                 <w:szCs w:val="21"/>
                 <w:lang w:val="es-US"/>
               </w:rPr>
-              <w:t xml:space="preserve">, </w:t>
             </w:r>
             <w:proofErr w:type="spellStart"/>
             <w:r>
@@ -28868,7 +28880,6 @@
                 <w:szCs w:val="21"/>
                 <w:lang w:val="es-US"/>
               </w:rPr>
-              <w:t>Inbox</w:t>
             </w:r>
             <w:proofErr w:type="spellEnd"/>
             <w:r>
@@ -28876,7 +28887,6 @@
                 <w:szCs w:val="21"/>
                 <w:lang w:val="es-US"/>
               </w:rPr>
-              <w:t xml:space="preserve"> y Cache-Aside para datos de referencia.</w:t>
             </w:r>
           </w:p>
         </w:tc>
@@ -28897,19 +28907,28 @@
                 <w:szCs w:val="21"/>
               </w:rPr>
             </w:pPr>
+            <w:proofErr w:type="spellStart"/>
             <w:r>
               <w:rPr>
                 <w:b w:val="0"/>
                 <w:szCs w:val="21"/>
               </w:rPr>
-              <w:t xml:space="preserve">Servicio de </w:t>
-            </w:r>
-            <w:proofErr w:type="spellStart"/>
+              <w:t>Servicio</w:t>
+            </w:r>
+            <w:proofErr w:type="spellEnd"/>
             <w:r>
               <w:rPr>
                 <w:b w:val="0"/>
                 <w:szCs w:val="21"/>
               </w:rPr>
+              <w:t xml:space="preserve"> de </w:t>
+            </w:r>
+            <w:proofErr w:type="spellStart"/>
+            <w:r>
+              <w:rPr>
+                <w:b w:val="0"/>
+                <w:szCs w:val="21"/>
+              </w:rPr>
               <w:t>Operaciones</w:t>
             </w:r>
             <w:proofErr w:type="spellEnd"/>
@@ -28933,7 +28952,7 @@
                 <w:szCs w:val="21"/>
                 <w:lang w:val="es-US"/>
               </w:rPr>
-              <w:t xml:space="preserve">Orquestador de Saga para rutas, CQRS selectivo, proyecciones de lectura, </w:t>
+              <w:t>CQRS selectivo, proyecciones de lectura, publicación de eventos operativos e idempotencia; Outbox/Inbox pueden implementarse internamente cuando corresponda.</w:t>
             </w:r>
             <w:proofErr w:type="spellStart"/>
             <w:r>
@@ -28941,7 +28960,6 @@
                 <w:szCs w:val="21"/>
                 <w:lang w:val="es-US"/>
               </w:rPr>
-              <w:t>Outbox</w:t>
             </w:r>
             <w:proofErr w:type="spellEnd"/>
             <w:r>
@@ -28949,7 +28967,6 @@
                 <w:szCs w:val="21"/>
                 <w:lang w:val="es-US"/>
               </w:rPr>
-              <w:t>/</w:t>
             </w:r>
             <w:proofErr w:type="spellStart"/>
             <w:r>
@@ -28957,7 +28974,6 @@
                 <w:szCs w:val="21"/>
                 <w:lang w:val="es-US"/>
               </w:rPr>
-              <w:t>Inbox</w:t>
             </w:r>
             <w:proofErr w:type="spellEnd"/>
             <w:r>
@@ -28965,7 +28981,6 @@
                 <w:szCs w:val="21"/>
                 <w:lang w:val="es-US"/>
               </w:rPr>
-              <w:t xml:space="preserve"> y </w:t>
             </w:r>
             <w:proofErr w:type="spellStart"/>
             <w:r>
@@ -28973,7 +28988,6 @@
                 <w:szCs w:val="21"/>
                 <w:lang w:val="es-US"/>
               </w:rPr>
-              <w:t>caching</w:t>
             </w:r>
             <w:proofErr w:type="spellEnd"/>
             <w:r>
@@ -28981,7 +28995,6 @@
                 <w:szCs w:val="21"/>
                 <w:lang w:val="es-US"/>
               </w:rPr>
-              <w:t xml:space="preserve"> de estado operativo.</w:t>
             </w:r>
           </w:p>
         </w:tc>
@@ -28999,19 +29012,28 @@
                 <w:szCs w:val="21"/>
               </w:rPr>
             </w:pPr>
+            <w:proofErr w:type="spellStart"/>
             <w:r>
               <w:rPr>
                 <w:b w:val="0"/>
                 <w:szCs w:val="21"/>
               </w:rPr>
-              <w:t xml:space="preserve">Servicio de </w:t>
-            </w:r>
-            <w:proofErr w:type="spellStart"/>
+              <w:t>Servicio</w:t>
+            </w:r>
+            <w:proofErr w:type="spellEnd"/>
             <w:r>
               <w:rPr>
                 <w:b w:val="0"/>
                 <w:szCs w:val="21"/>
               </w:rPr>
+              <w:t xml:space="preserve"> de </w:t>
+            </w:r>
+            <w:proofErr w:type="spellStart"/>
+            <w:r>
+              <w:rPr>
+                <w:b w:val="0"/>
+                <w:szCs w:val="21"/>
+              </w:rPr>
               <w:t>Interacción</w:t>
             </w:r>
             <w:proofErr w:type="spellEnd"/>
@@ -29035,7 +29057,7 @@
                 <w:szCs w:val="21"/>
                 <w:lang w:val="es-US"/>
               </w:rPr>
-              <w:t xml:space="preserve">Consumidor idempotente, </w:t>
+              <w:t>Consumidor idempotente, auditoría de eventos, Bulkhead, Retry, Circuit Breaker y manejo de mensajes no procesables.</w:t>
             </w:r>
             <w:proofErr w:type="spellStart"/>
             <w:r>
@@ -29043,7 +29065,6 @@
                 <w:szCs w:val="21"/>
                 <w:lang w:val="es-US"/>
               </w:rPr>
-              <w:t>Bulkhead</w:t>
             </w:r>
             <w:proofErr w:type="spellEnd"/>
             <w:r>
@@ -29051,7 +29072,6 @@
                 <w:szCs w:val="21"/>
                 <w:lang w:val="es-US"/>
               </w:rPr>
-              <w:t xml:space="preserve">, </w:t>
             </w:r>
             <w:proofErr w:type="spellStart"/>
             <w:r>
@@ -29059,7 +29079,6 @@
                 <w:szCs w:val="21"/>
                 <w:lang w:val="es-US"/>
               </w:rPr>
-              <w:t>Retry</w:t>
             </w:r>
             <w:proofErr w:type="spellEnd"/>
             <w:r>
@@ -29067,7 +29086,6 @@
                 <w:szCs w:val="21"/>
                 <w:lang w:val="es-US"/>
               </w:rPr>
-              <w:t xml:space="preserve">, </w:t>
             </w:r>
             <w:proofErr w:type="spellStart"/>
             <w:r>
@@ -29075,7 +29093,6 @@
                 <w:szCs w:val="21"/>
                 <w:lang w:val="es-US"/>
               </w:rPr>
-              <w:t>Circuit</w:t>
             </w:r>
             <w:proofErr w:type="spellEnd"/>
             <w:r>
@@ -29083,7 +29100,6 @@
                 <w:szCs w:val="21"/>
                 <w:lang w:val="es-US"/>
               </w:rPr>
-              <w:t xml:space="preserve"> Breaker y manejo de mensajes no procesables.</w:t>
             </w:r>
           </w:p>
         </w:tc>
@@ -29582,13 +29598,23 @@
                 <w:lang w:val="es-US"/>
               </w:rPr>
             </w:pPr>
+            <w:proofErr w:type="spellStart"/>
             <w:r>
               <w:rPr>
                 <w:b w:val="0"/>
                 <w:szCs w:val="21"/>
                 <w:lang w:val="es-US"/>
               </w:rPr>
-              <w:t>Write-Behind Cache para operaciones críticas</w:t>
+              <w:t>Write-Behind</w:t>
+            </w:r>
+            <w:proofErr w:type="spellEnd"/>
+            <w:r>
+              <w:rPr>
+                <w:b w:val="0"/>
+                <w:szCs w:val="21"/>
+                <w:lang w:val="es-US"/>
+              </w:rPr>
+              <w:t xml:space="preserve"> Cache para operaciones críticas</w:t>
             </w:r>
           </w:p>
         </w:tc>
@@ -29631,98 +29657,90 @@
                 <w:szCs w:val="21"/>
               </w:rPr>
             </w:pPr>
-            <w:proofErr w:type="spellStart"/>
             <w:r>
               <w:rPr>
                 <w:b w:val="0"/>
                 <w:szCs w:val="21"/>
               </w:rPr>
-              <w:t>Microservicio</w:t>
-            </w:r>
-            <w:proofErr w:type="spellEnd"/>
+              <w:t xml:space="preserve">Microservicio de </w:t>
+            </w:r>
+            <w:proofErr w:type="spellStart"/>
             <w:r>
               <w:rPr>
                 <w:b w:val="0"/>
                 <w:szCs w:val="21"/>
               </w:rPr>
-              <w:t xml:space="preserve"> de </w:t>
-            </w:r>
-            <w:proofErr w:type="spellStart"/>
+              <w:t>orquestación</w:t>
+            </w:r>
+            <w:proofErr w:type="spellEnd"/>
             <w:r>
               <w:rPr>
                 <w:b w:val="0"/>
                 <w:szCs w:val="21"/>
               </w:rPr>
-              <w:t>orquestación</w:t>
-            </w:r>
-            <w:proofErr w:type="spellEnd"/>
+              <w:t xml:space="preserve"> </w:t>
+            </w:r>
+            <w:proofErr w:type="spellStart"/>
             <w:r>
               <w:rPr>
                 <w:b w:val="0"/>
                 <w:szCs w:val="21"/>
               </w:rPr>
-              <w:t xml:space="preserve"> </w:t>
-            </w:r>
-            <w:proofErr w:type="spellStart"/>
+              <w:t>independiente</w:t>
+            </w:r>
+            <w:proofErr w:type="spellEnd"/>
+          </w:p>
+        </w:tc>
+        <w:tc>
+          <w:tcPr>
+            <w:tcW w:w="5126" w:type="dxa"/>
+          </w:tcPr>
+          <w:p>
+            <w:pPr>
+              <w:spacing w:after="0" w:line="240" w:lineRule="auto"/>
+              <w:cnfStyle w:val="000000100000" w:firstRow="0" w:lastRow="0" w:firstColumn="0" w:lastColumn="0" w:oddVBand="0" w:evenVBand="0" w:oddHBand="1" w:evenHBand="0" w:firstRowFirstColumn="0" w:firstRowLastColumn="0" w:lastRowFirstColumn="0" w:lastRowLastColumn="0"/>
+              <w:rPr>
+                <w:szCs w:val="21"/>
+                <w:lang w:val="es-US"/>
+              </w:rPr>
+            </w:pPr>
+            <w:r>
+              <w:rPr>
+                <w:szCs w:val="21"/>
+                <w:lang w:val="es-US"/>
+              </w:rPr>
+              <w:t xml:space="preserve">Se difiere. Las primeras Sagas se orquestarán desde </w:t>
+            </w:r>
+            <w:r>
+              <w:rPr>
+                <w:szCs w:val="21"/>
+                <w:lang w:val="es-US"/>
+              </w:rPr>
+              <w:lastRenderedPageBreak/>
+              <w:t>el Servicio de Operaciones; se reevaluará si se presentan múltiples procesos distribuidos complejos.</w:t>
+            </w:r>
+          </w:p>
+        </w:tc>
+      </w:tr>
+      <w:tr>
+        <w:tc>
+          <w:tcPr>
+            <w:cnfStyle w:val="001000000000" w:firstRow="0" w:lastRow="0" w:firstColumn="1" w:lastColumn="0" w:oddVBand="0" w:evenVBand="0" w:oddHBand="0" w:evenHBand="0" w:firstRowFirstColumn="0" w:firstRowLastColumn="0" w:lastRowFirstColumn="0" w:lastRowLastColumn="0"/>
+            <w:tcW w:w="4518" w:type="dxa"/>
+          </w:tcPr>
+          <w:p>
+            <w:pPr>
+              <w:spacing w:after="0" w:line="240" w:lineRule="auto"/>
+              <w:rPr>
+                <w:szCs w:val="21"/>
+              </w:rPr>
+            </w:pPr>
             <w:r>
               <w:rPr>
                 <w:b w:val="0"/>
                 <w:szCs w:val="21"/>
               </w:rPr>
-              <w:t>independiente</w:t>
-            </w:r>
-            <w:proofErr w:type="spellEnd"/>
-          </w:p>
-        </w:tc>
-        <w:tc>
-          <w:tcPr>
-            <w:tcW w:w="5126" w:type="dxa"/>
-          </w:tcPr>
-          <w:p>
-            <w:pPr>
-              <w:spacing w:after="0" w:line="240" w:lineRule="auto"/>
-              <w:cnfStyle w:val="000000100000" w:firstRow="0" w:lastRow="0" w:firstColumn="0" w:lastColumn="0" w:oddVBand="0" w:evenVBand="0" w:oddHBand="1" w:evenHBand="0" w:firstRowFirstColumn="0" w:firstRowLastColumn="0" w:lastRowFirstColumn="0" w:lastRowLastColumn="0"/>
-              <w:rPr>
-                <w:szCs w:val="21"/>
-                <w:lang w:val="es-US"/>
-              </w:rPr>
-            </w:pPr>
-            <w:r>
-              <w:rPr>
-                <w:szCs w:val="21"/>
-                <w:lang w:val="es-US"/>
-              </w:rPr>
-              <w:t xml:space="preserve">Se difiere. Las primeras Sagas se orquestarán desde </w:t>
-            </w:r>
-            <w:r>
-              <w:rPr>
-                <w:szCs w:val="21"/>
-                <w:lang w:val="es-US"/>
-              </w:rPr>
               <w:lastRenderedPageBreak/>
-              <w:t>el Servicio de Operaciones; se reevaluará si se presentan múltiples procesos distribuidos complejos.</w:t>
-            </w:r>
-          </w:p>
-        </w:tc>
-      </w:tr>
-      <w:tr>
-        <w:tc>
-          <w:tcPr>
-            <w:cnfStyle w:val="001000000000" w:firstRow="0" w:lastRow="0" w:firstColumn="1" w:lastColumn="0" w:oddVBand="0" w:evenVBand="0" w:oddHBand="0" w:evenHBand="0" w:firstRowFirstColumn="0" w:firstRowLastColumn="0" w:lastRowFirstColumn="0" w:lastRowLastColumn="0"/>
-            <w:tcW w:w="4518" w:type="dxa"/>
-          </w:tcPr>
-          <w:p>
-            <w:pPr>
-              <w:spacing w:after="0" w:line="240" w:lineRule="auto"/>
-              <w:rPr>
-                <w:szCs w:val="21"/>
-              </w:rPr>
-            </w:pPr>
-            <w:r>
-              <w:rPr>
-                <w:b w:val="0"/>
-                <w:szCs w:val="21"/>
-              </w:rPr>
               <w:t xml:space="preserve">Backend for Frontend </w:t>
             </w:r>
             <w:proofErr w:type="spellStart"/>
@@ -31627,52 +31645,45 @@
               <w:rPr>
                 <w:lang w:val="es-CR"/>
               </w:rPr>
-              <w:t>Movix</w:t>
+              <w:t>Movix es una plataforma SaaS multioperador basada en microservicios. El Servicio Principal administra operadores, usuarios y roles, choferes, pasajeros, perfiles médicos o veterinarios y configuraciones; el Servicio de Operaciones gestiona rutas, seguimiento, abordajes, entregas, solicitudes especiales e incidentes; el Servicio de Interacción conserva auditoría y estado de envío, y la aplicación móvil permite operación offline.</w:t>
             </w:r>
             <w:proofErr w:type="spellEnd"/>
             <w:r>
               <w:rPr>
                 <w:lang w:val="es-CR"/>
               </w:rPr>
-              <w:t xml:space="preserve"> es una plataforma SaaS </w:t>
             </w:r>
             <w:proofErr w:type="spellStart"/>
             <w:r>
               <w:rPr>
                 <w:lang w:val="es-CR"/>
               </w:rPr>
-              <w:t>multioperador</w:t>
             </w:r>
             <w:proofErr w:type="spellEnd"/>
             <w:r>
               <w:rPr>
                 <w:lang w:val="es-CR"/>
               </w:rPr>
-              <w:t xml:space="preserve"> basada en microservicios que gestiona información de </w:t>
-            </w:r>
-            <w:r>
-              <w:rPr>
-                <w:lang w:val="es-CR"/>
-              </w:rPr>
-              <w:t>diversa</w:t>
-            </w:r>
-            <w:r>
-              <w:rPr>
-                <w:lang w:val="es-CR"/>
-              </w:rPr>
-              <w:t xml:space="preserve"> naturaleza y con </w:t>
-            </w:r>
-            <w:r>
-              <w:rPr>
-                <w:lang w:val="es-CR"/>
-              </w:rPr>
-              <w:t>necesidades operativas diversas</w:t>
-            </w:r>
-            <w:r>
-              <w:rPr>
-                <w:lang w:val="es-CR"/>
-              </w:rPr>
-              <w:t>. El Servicio Principal administra operadores, usuarios, choferes, pasajeros, vehículos, perfiles médicos o veterinarios y configuraciones; el Servicio de Operaciones gestiona rutas, seguimiento, abordajes, entregas, solicitudes especiales e incidentes; adicionalmente, la plataforma requiere conservar información de auditoría y permitir la operación móvil en escenarios de conectividad limitada. La arquitectura debe mantener el aislamiento entre operadores, permitir la evolución independiente de los servicios y soportar distintos patrones de almacenamiento.</w:t>
+            </w:r>
+            <w:r>
+              <w:rPr>
+                <w:lang w:val="es-CR"/>
+              </w:rPr>
+            </w:r>
+            <w:r>
+              <w:rPr>
+                <w:lang w:val="es-CR"/>
+              </w:rPr>
+            </w:r>
+            <w:r>
+              <w:rPr>
+                <w:lang w:val="es-CR"/>
+              </w:rPr>
+            </w:r>
+            <w:r>
+              <w:rPr>
+                <w:lang w:val="es-CR"/>
+              </w:rPr>
             </w:r>
           </w:p>
         </w:tc>
@@ -31852,6 +31863,7 @@
               <w:rPr>
                 <w:lang w:val="es-CR"/>
               </w:rPr>
+              <w:lastRenderedPageBreak/>
               <w:t>Justificación</w:t>
             </w:r>
           </w:p>
@@ -32187,6 +32199,7 @@
               <w:rPr>
                 <w:lang w:val="es-CR"/>
               </w:rPr>
+              <w:lastRenderedPageBreak/>
               <w:t>Riesgos / mitigación</w:t>
             </w:r>
           </w:p>
@@ -34097,7 +34110,7 @@
 </file>
 
 <file path=word/endnotes.xml><?xml version="1.0" encoding="utf-8"?>
-<w:endnotes xmlns:wpc="http://schemas.microsoft.com/office/word/2010/wordprocessingCanvas" xmlns:cx="http://schemas.microsoft.com/office/drawing/2014/chartex" xmlns:cx1="http://schemas.microsoft.com/office/drawing/2015/9/8/chartex" xmlns:cx2="http://schemas.microsoft.com/office/drawing/2015/10/21/chartex" xmlns:cx3="http://schemas.microsoft.com/office/drawing/2016/5/9/chartex" xmlns:cx4="http://schemas.microsoft.com/office/drawing/2016/5/10/chartex" xmlns:cx5="http://schemas.microsoft.com/office/drawing/2016/5/11/chartex" xmlns:cx6="http://schemas.microsoft.com/office/drawing/2016/5/12/chartex" xmlns:cx7="http://schemas.microsoft.com/office/drawing/2016/5/13/chartex" xmlns:cx8="http://schemas.microsoft.com/office/drawing/2016/5/14/chartex" xmlns:mc="http://schemas.openxmlformats.org/markup-compatibility/2006" xmlns:aink="http://schemas.microsoft.com/office/drawing/2016/ink" xmlns:am3d="http://schemas.microsoft.com/office/drawing/2017/model3d" xmlns:o="urn:schemas-microsoft-com:office:office" xmlns:oel="http://schemas.microsoft.com/office/2019/extlst" xmlns:r="http://schemas.openxmlformats.org/officeDocument/2006/relationships" xmlns:m="http://schemas.openxmlformats.org/officeDocument/2006/math" xmlns:v="urn:schemas-microsoft-com:vml" xmlns:wp14="http://schemas.microsoft.com/office/word/2010/wordprocessingDrawing" xmlns:wp="http://schemas.openxmlformats.org/drawingml/2006/wordprocessingDrawing" xmlns:w10="urn:schemas-microsoft-com:office:word" xmlns:w="http://schemas.openxmlformats.org/wordprocessingml/2006/main" xmlns:w14="http://schemas.microsoft.com/office/word/2010/wordml" xmlns:w15="http://schemas.microsoft.com/office/word/2012/wordml" xmlns:w16cei="http://schemas.microsoft.com/office/word/2026/wordml/cei" xmlns:w16cex="http://schemas.microsoft.com/office/word/2018/wordml/cex" xmlns:w16cid="http://schemas.microsoft.com/office/word/2016/wordml/cid" xmlns:w16="http://schemas.microsoft.com/office/word/2018/wordml" xmlns:w16du="http://schemas.microsoft.com/office/word/2023/wordml/word16du" xmlns:w16sdtdh="http://schemas.microsoft.com/office/word/2020/wordml/sdtdatahash" xmlns:w16sdtfl="http://schemas.microsoft.com/office/word/2024/wordml/sdtformatlock" xmlns:w16se="http://schemas.microsoft.com/office/word/2015/wordml/symex" xmlns:wpg="http://schemas.microsoft.com/office/word/2010/wordprocessingGroup" xmlns:wpi="http://schemas.microsoft.com/office/word/2010/wordprocessingInk" xmlns:wne="http://schemas.microsoft.com/office/word/2006/wordml" xmlns:wps="http://schemas.microsoft.com/office/word/2010/wordprocessingShape" mc:Ignorable="w14 w15 w16se w16cid w16 w16cex w16sdtdh w16sdtfl w16du wp14">
+<w:endnotes xmlns:wpc="http://schemas.microsoft.com/office/word/2010/wordprocessingCanvas" xmlns:cx="http://schemas.microsoft.com/office/drawing/2014/chartex" xmlns:cx1="http://schemas.microsoft.com/office/drawing/2015/9/8/chartex" xmlns:cx2="http://schemas.microsoft.com/office/drawing/2015/10/21/chartex" xmlns:cx3="http://schemas.microsoft.com/office/drawing/2016/5/9/chartex" xmlns:cx4="http://schemas.microsoft.com/office/drawing/2016/5/10/chartex" xmlns:cx5="http://schemas.microsoft.com/office/drawing/2016/5/11/chartex" xmlns:cx6="http://schemas.microsoft.com/office/drawing/2016/5/12/chartex" xmlns:cx7="http://schemas.microsoft.com/office/drawing/2016/5/13/chartex" xmlns:cx8="http://schemas.microsoft.com/office/drawing/2016/5/14/chartex" xmlns:mc="http://schemas.openxmlformats.org/markup-compatibility/2006" xmlns:aink="http://schemas.microsoft.com/office/drawing/2016/ink" xmlns:am3d="http://schemas.microsoft.com/office/drawing/2017/model3d" xmlns:o="urn:schemas-microsoft-com:office:office" xmlns:oel="http://schemas.microsoft.com/office/2019/extlst" xmlns:r="http://schemas.openxmlformats.org/officeDocument/2006/relationships" xmlns:m="http://schemas.openxmlformats.org/officeDocument/2006/math" xmlns:v="urn:schemas-microsoft-com:vml" xmlns:wp14="http://schemas.microsoft.com/office/word/2010/wordprocessingDrawing" xmlns:wp="http://schemas.openxmlformats.org/drawingml/2006/wordprocessingDrawing" xmlns:w10="urn:schemas-microsoft-com:office:word" xmlns:w="http://schemas.openxmlformats.org/wordprocessingml/2006/main" xmlns:w14="http://schemas.microsoft.com/office/word/2010/wordml" xmlns:w15="http://schemas.microsoft.com/office/word/2012/wordml" xmlns:w16cex="http://schemas.microsoft.com/office/word/2018/wordml/cex" xmlns:w16cid="http://schemas.microsoft.com/office/word/2016/wordml/cid" xmlns:w16="http://schemas.microsoft.com/office/word/2018/wordml" xmlns:w16du="http://schemas.microsoft.com/office/word/2023/wordml/word16du" xmlns:w16sdtdh="http://schemas.microsoft.com/office/word/2020/wordml/sdtdatahash" xmlns:w16sdtfl="http://schemas.microsoft.com/office/word/2024/wordml/sdtformatlock" xmlns:w16se="http://schemas.microsoft.com/office/word/2015/wordml/symex" xmlns:wpg="http://schemas.microsoft.com/office/word/2010/wordprocessingGroup" xmlns:wpi="http://schemas.microsoft.com/office/word/2010/wordprocessingInk" xmlns:wne="http://schemas.microsoft.com/office/word/2006/wordml" xmlns:wps="http://schemas.microsoft.com/office/word/2010/wordprocessingShape" mc:Ignorable="w14 w15 w16se w16cid w16 w16cex w16sdtdh w16sdtfl w16du wp14">
   <w:endnote w:type="separator" w:id="-1">
     <w:p>
       <w:pPr>
@@ -34122,7 +34135,7 @@
 </file>
 
 <file path=word/footer1.xml><?xml version="1.0" encoding="utf-8"?>
-<w:ftr xmlns:wpc="http://schemas.microsoft.com/office/word/2010/wordprocessingCanvas" xmlns:cx="http://schemas.microsoft.com/office/drawing/2014/chartex" xmlns:cx1="http://schemas.microsoft.com/office/drawing/2015/9/8/chartex" xmlns:cx2="http://schemas.microsoft.com/office/drawing/2015/10/21/chartex" xmlns:cx3="http://schemas.microsoft.com/office/drawing/2016/5/9/chartex" xmlns:cx4="http://schemas.microsoft.com/office/drawing/2016/5/10/chartex" xmlns:cx5="http://schemas.microsoft.com/office/drawing/2016/5/11/chartex" xmlns:cx6="http://schemas.microsoft.com/office/drawing/2016/5/12/chartex" xmlns:cx7="http://schemas.microsoft.com/office/drawing/2016/5/13/chartex" xmlns:cx8="http://schemas.microsoft.com/office/drawing/2016/5/14/chartex" xmlns:mc="http://schemas.openxmlformats.org/markup-compatibility/2006" xmlns:aink="http://schemas.microsoft.com/office/drawing/2016/ink" xmlns:am3d="http://schemas.microsoft.com/office/drawing/2017/model3d" xmlns:o="urn:schemas-microsoft-com:office:office" xmlns:oel="http://schemas.microsoft.com/office/2019/extlst" xmlns:r="http://schemas.openxmlformats.org/officeDocument/2006/relationships" xmlns:m="http://schemas.openxmlformats.org/officeDocument/2006/math" xmlns:v="urn:schemas-microsoft-com:vml" xmlns:wp14="http://schemas.microsoft.com/office/word/2010/wordprocessingDrawing" xmlns:wp="http://schemas.openxmlformats.org/drawingml/2006/wordprocessingDrawing" xmlns:w10="urn:schemas-microsoft-com:office:word" xmlns:w="http://schemas.openxmlformats.org/wordprocessingml/2006/main" xmlns:w14="http://schemas.microsoft.com/office/word/2010/wordml" xmlns:w15="http://schemas.microsoft.com/office/word/2012/wordml" xmlns:w16cei="http://schemas.microsoft.com/office/word/2026/wordml/cei" xmlns:w16cex="http://schemas.microsoft.com/office/word/2018/wordml/cex" xmlns:w16cid="http://schemas.microsoft.com/office/word/2016/wordml/cid" xmlns:w16="http://schemas.microsoft.com/office/word/2018/wordml" xmlns:w16du="http://schemas.microsoft.com/office/word/2023/wordml/word16du" xmlns:w16sdtdh="http://schemas.microsoft.com/office/word/2020/wordml/sdtdatahash" xmlns:w16sdtfl="http://schemas.microsoft.com/office/word/2024/wordml/sdtformatlock" xmlns:w16se="http://schemas.microsoft.com/office/word/2015/wordml/symex" xmlns:wpg="http://schemas.microsoft.com/office/word/2010/wordprocessingGroup" xmlns:wpi="http://schemas.microsoft.com/office/word/2010/wordprocessingInk" xmlns:wne="http://schemas.microsoft.com/office/word/2006/wordml" xmlns:wps="http://schemas.microsoft.com/office/word/2010/wordprocessingShape" mc:Ignorable="w14 w15 w16se w16cid w16 w16cex w16sdtdh w16sdtfl w16du wp14">
+<w:ftr xmlns:wpc="http://schemas.microsoft.com/office/word/2010/wordprocessingCanvas" xmlns:cx="http://schemas.microsoft.com/office/drawing/2014/chartex" xmlns:cx1="http://schemas.microsoft.com/office/drawing/2015/9/8/chartex" xmlns:cx2="http://schemas.microsoft.com/office/drawing/2015/10/21/chartex" xmlns:cx3="http://schemas.microsoft.com/office/drawing/2016/5/9/chartex" xmlns:cx4="http://schemas.microsoft.com/office/drawing/2016/5/10/chartex" xmlns:cx5="http://schemas.microsoft.com/office/drawing/2016/5/11/chartex" xmlns:cx6="http://schemas.microsoft.com/office/drawing/2016/5/12/chartex" xmlns:cx7="http://schemas.microsoft.com/office/drawing/2016/5/13/chartex" xmlns:cx8="http://schemas.microsoft.com/office/drawing/2016/5/14/chartex" xmlns:mc="http://schemas.openxmlformats.org/markup-compatibility/2006" xmlns:aink="http://schemas.microsoft.com/office/drawing/2016/ink" xmlns:am3d="http://schemas.microsoft.com/office/drawing/2017/model3d" xmlns:o="urn:schemas-microsoft-com:office:office" xmlns:oel="http://schemas.microsoft.com/office/2019/extlst" xmlns:r="http://schemas.openxmlformats.org/officeDocument/2006/relationships" xmlns:m="http://schemas.openxmlformats.org/officeDocument/2006/math" xmlns:v="urn:schemas-microsoft-com:vml" xmlns:wp14="http://schemas.microsoft.com/office/word/2010/wordprocessingDrawing" xmlns:wp="http://schemas.openxmlformats.org/drawingml/2006/wordprocessingDrawing" xmlns:w10="urn:schemas-microsoft-com:office:word" xmlns:w="http://schemas.openxmlformats.org/wordprocessingml/2006/main" xmlns:w14="http://schemas.microsoft.com/office/word/2010/wordml" xmlns:w15="http://schemas.microsoft.com/office/word/2012/wordml" xmlns:w16cex="http://schemas.microsoft.com/office/word/2018/wordml/cex" xmlns:w16cid="http://schemas.microsoft.com/office/word/2016/wordml/cid" xmlns:w16="http://schemas.microsoft.com/office/word/2018/wordml" xmlns:w16du="http://schemas.microsoft.com/office/word/2023/wordml/word16du" xmlns:w16sdtdh="http://schemas.microsoft.com/office/word/2020/wordml/sdtdatahash" xmlns:w16sdtfl="http://schemas.microsoft.com/office/word/2024/wordml/sdtformatlock" xmlns:w16se="http://schemas.microsoft.com/office/word/2015/wordml/symex" xmlns:wpg="http://schemas.microsoft.com/office/word/2010/wordprocessingGroup" xmlns:wpi="http://schemas.microsoft.com/office/word/2010/wordprocessingInk" xmlns:wne="http://schemas.microsoft.com/office/word/2006/wordml" xmlns:wps="http://schemas.microsoft.com/office/word/2010/wordprocessingShape" mc:Ignorable="w14 w15 w16se w16cid w16 w16cex w16sdtdh w16sdtfl w16du wp14">
   <w:p>
     <w:pPr>
       <w:pStyle w:val="Footer"/>
@@ -34154,7 +34167,7 @@
 </file>
 
 <file path=word/footnotes.xml><?xml version="1.0" encoding="utf-8"?>
-<w:footnotes xmlns:wpc="http://schemas.microsoft.com/office/word/2010/wordprocessingCanvas" xmlns:cx="http://schemas.microsoft.com/office/drawing/2014/chartex" xmlns:cx1="http://schemas.microsoft.com/office/drawing/2015/9/8/chartex" xmlns:cx2="http://schemas.microsoft.com/office/drawing/2015/10/21/chartex" xmlns:cx3="http://schemas.microsoft.com/office/drawing/2016/5/9/chartex" xmlns:cx4="http://schemas.microsoft.com/office/drawing/2016/5/10/chartex" xmlns:cx5="http://schemas.microsoft.com/office/drawing/2016/5/11/chartex" xmlns:cx6="http://schemas.microsoft.com/office/drawing/2016/5/12/chartex" xmlns:cx7="http://schemas.microsoft.com/office/drawing/2016/5/13/chartex" xmlns:cx8="http://schemas.microsoft.com/office/drawing/2016/5/14/chartex" xmlns:mc="http://schemas.openxmlformats.org/markup-compatibility/2006" xmlns:aink="http://schemas.microsoft.com/office/drawing/2016/ink" xmlns:am3d="http://schemas.microsoft.com/office/drawing/2017/model3d" xmlns:o="urn:schemas-microsoft-com:office:office" xmlns:oel="http://schemas.microsoft.com/office/2019/extlst" xmlns:r="http://schemas.openxmlformats.org/officeDocument/2006/relationships" xmlns:m="http://schemas.openxmlformats.org/officeDocument/2006/math" xmlns:v="urn:schemas-microsoft-com:vml" xmlns:wp14="http://schemas.microsoft.com/office/word/2010/wordprocessingDrawing" xmlns:wp="http://schemas.openxmlformats.org/drawingml/2006/wordprocessingDrawing" xmlns:w10="urn:schemas-microsoft-com:office:word" xmlns:w="http://schemas.openxmlformats.org/wordprocessingml/2006/main" xmlns:w14="http://schemas.microsoft.com/office/word/2010/wordml" xmlns:w15="http://schemas.microsoft.com/office/word/2012/wordml" xmlns:w16cei="http://schemas.microsoft.com/office/word/2026/wordml/cei" xmlns:w16cex="http://schemas.microsoft.com/office/word/2018/wordml/cex" xmlns:w16cid="http://schemas.microsoft.com/office/word/2016/wordml/cid" xmlns:w16="http://schemas.microsoft.com/office/word/2018/wordml" xmlns:w16du="http://schemas.microsoft.com/office/word/2023/wordml/word16du" xmlns:w16sdtdh="http://schemas.microsoft.com/office/word/2020/wordml/sdtdatahash" xmlns:w16sdtfl="http://schemas.microsoft.com/office/word/2024/wordml/sdtformatlock" xmlns:w16se="http://schemas.microsoft.com/office/word/2015/wordml/symex" xmlns:wpg="http://schemas.microsoft.com/office/word/2010/wordprocessingGroup" xmlns:wpi="http://schemas.microsoft.com/office/word/2010/wordprocessingInk" xmlns:wne="http://schemas.microsoft.com/office/word/2006/wordml" xmlns:wps="http://schemas.microsoft.com/office/word/2010/wordprocessingShape" mc:Ignorable="w14 w15 w16se w16cid w16 w16cex w16sdtdh w16sdtfl w16du wp14">
+<w:footnotes xmlns:wpc="http://schemas.microsoft.com/office/word/2010/wordprocessingCanvas" xmlns:cx="http://schemas.microsoft.com/office/drawing/2014/chartex" xmlns:cx1="http://schemas.microsoft.com/office/drawing/2015/9/8/chartex" xmlns:cx2="http://schemas.microsoft.com/office/drawing/2015/10/21/chartex" xmlns:cx3="http://schemas.microsoft.com/office/drawing/2016/5/9/chartex" xmlns:cx4="http://schemas.microsoft.com/office/drawing/2016/5/10/chartex" xmlns:cx5="http://schemas.microsoft.com/office/drawing/2016/5/11/chartex" xmlns:cx6="http://schemas.microsoft.com/office/drawing/2016/5/12/chartex" xmlns:cx7="http://schemas.microsoft.com/office/drawing/2016/5/13/chartex" xmlns:cx8="http://schemas.microsoft.com/office/drawing/2016/5/14/chartex" xmlns:mc="http://schemas.openxmlformats.org/markup-compatibility/2006" xmlns:aink="http://schemas.microsoft.com/office/drawing/2016/ink" xmlns:am3d="http://schemas.microsoft.com/office/drawing/2017/model3d" xmlns:o="urn:schemas-microsoft-com:office:office" xmlns:oel="http://schemas.microsoft.com/office/2019/extlst" xmlns:r="http://schemas.openxmlformats.org/officeDocument/2006/relationships" xmlns:m="http://schemas.openxmlformats.org/officeDocument/2006/math" xmlns:v="urn:schemas-microsoft-com:vml" xmlns:wp14="http://schemas.microsoft.com/office/word/2010/wordprocessingDrawing" xmlns:wp="http://schemas.openxmlformats.org/drawingml/2006/wordprocessingDrawing" xmlns:w10="urn:schemas-microsoft-com:office:word" xmlns:w="http://schemas.openxmlformats.org/wordprocessingml/2006/main" xmlns:w14="http://schemas.microsoft.com/office/word/2010/wordml" xmlns:w15="http://schemas.microsoft.com/office/word/2012/wordml" xmlns:w16cex="http://schemas.microsoft.com/office/word/2018/wordml/cex" xmlns:w16cid="http://schemas.microsoft.com/office/word/2016/wordml/cid" xmlns:w16="http://schemas.microsoft.com/office/word/2018/wordml" xmlns:w16du="http://schemas.microsoft.com/office/word/2023/wordml/word16du" xmlns:w16sdtdh="http://schemas.microsoft.com/office/word/2020/wordml/sdtdatahash" xmlns:w16sdtfl="http://schemas.microsoft.com/office/word/2024/wordml/sdtformatlock" xmlns:w16se="http://schemas.microsoft.com/office/word/2015/wordml/symex" xmlns:wpg="http://schemas.microsoft.com/office/word/2010/wordprocessingGroup" xmlns:wpi="http://schemas.microsoft.com/office/word/2010/wordprocessingInk" xmlns:wne="http://schemas.microsoft.com/office/word/2006/wordml" xmlns:wps="http://schemas.microsoft.com/office/word/2010/wordprocessingShape" mc:Ignorable="w14 w15 w16se w16cid w16 w16cex w16sdtdh w16sdtfl w16du wp14">
   <w:footnote w:type="separator" w:id="-1">
     <w:p>
       <w:pPr>
@@ -34179,7 +34192,7 @@
 </file>
 
 <file path=word/header1.xml><?xml version="1.0" encoding="utf-8"?>
-<w:hdr xmlns:wpc="http://schemas.microsoft.com/office/word/2010/wordprocessingCanvas" xmlns:cx="http://schemas.microsoft.com/office/drawing/2014/chartex" xmlns:cx1="http://schemas.microsoft.com/office/drawing/2015/9/8/chartex" xmlns:cx2="http://schemas.microsoft.com/office/drawing/2015/10/21/chartex" xmlns:cx3="http://schemas.microsoft.com/office/drawing/2016/5/9/chartex" xmlns:cx4="http://schemas.microsoft.com/office/drawing/2016/5/10/chartex" xmlns:cx5="http://schemas.microsoft.com/office/drawing/2016/5/11/chartex" xmlns:cx6="http://schemas.microsoft.com/office/drawing/2016/5/12/chartex" xmlns:cx7="http://schemas.microsoft.com/office/drawing/2016/5/13/chartex" xmlns:cx8="http://schemas.microsoft.com/office/drawing/2016/5/14/chartex" xmlns:mc="http://schemas.openxmlformats.org/markup-compatibility/2006" xmlns:aink="http://schemas.microsoft.com/office/drawing/2016/ink" xmlns:am3d="http://schemas.microsoft.com/office/drawing/2017/model3d" xmlns:o="urn:schemas-microsoft-com:office:office" xmlns:oel="http://schemas.microsoft.com/office/2019/extlst" xmlns:r="http://schemas.openxmlformats.org/officeDocument/2006/relationships" xmlns:m="http://schemas.openxmlformats.org/officeDocument/2006/math" xmlns:v="urn:schemas-microsoft-com:vml" xmlns:wp14="http://schemas.microsoft.com/office/word/2010/wordprocessingDrawing" xmlns:wp="http://schemas.openxmlformats.org/drawingml/2006/wordprocessingDrawing" xmlns:w10="urn:schemas-microsoft-com:office:word" xmlns:w="http://schemas.openxmlformats.org/wordprocessingml/2006/main" xmlns:w14="http://schemas.microsoft.com/office/word/2010/wordml" xmlns:w15="http://schemas.microsoft.com/office/word/2012/wordml" xmlns:w16cei="http://schemas.microsoft.com/office/word/2026/wordml/cei" xmlns:w16cex="http://schemas.microsoft.com/office/word/2018/wordml/cex" xmlns:w16cid="http://schemas.microsoft.com/office/word/2016/wordml/cid" xmlns:w16="http://schemas.microsoft.com/office/word/2018/wordml" xmlns:w16du="http://schemas.microsoft.com/office/word/2023/wordml/word16du" xmlns:w16sdtdh="http://schemas.microsoft.com/office/word/2020/wordml/sdtdatahash" xmlns:w16sdtfl="http://schemas.microsoft.com/office/word/2024/wordml/sdtformatlock" xmlns:w16se="http://schemas.microsoft.com/office/word/2015/wordml/symex" xmlns:wpg="http://schemas.microsoft.com/office/word/2010/wordprocessingGroup" xmlns:wpi="http://schemas.microsoft.com/office/word/2010/wordprocessingInk" xmlns:wne="http://schemas.microsoft.com/office/word/2006/wordml" xmlns:wps="http://schemas.microsoft.com/office/word/2010/wordprocessingShape" mc:Ignorable="w14 w15 w16se w16cid w16 w16cex w16sdtdh w16sdtfl w16du wp14">
+<w:hdr xmlns:wpc="http://schemas.microsoft.com/office/word/2010/wordprocessingCanvas" xmlns:cx="http://schemas.microsoft.com/office/drawing/2014/chartex" xmlns:cx1="http://schemas.microsoft.com/office/drawing/2015/9/8/chartex" xmlns:cx2="http://schemas.microsoft.com/office/drawing/2015/10/21/chartex" xmlns:cx3="http://schemas.microsoft.com/office/drawing/2016/5/9/chartex" xmlns:cx4="http://schemas.microsoft.com/office/drawing/2016/5/10/chartex" xmlns:cx5="http://schemas.microsoft.com/office/drawing/2016/5/11/chartex" xmlns:cx6="http://schemas.microsoft.com/office/drawing/2016/5/12/chartex" xmlns:cx7="http://schemas.microsoft.com/office/drawing/2016/5/13/chartex" xmlns:cx8="http://schemas.microsoft.com/office/drawing/2016/5/14/chartex" xmlns:mc="http://schemas.openxmlformats.org/markup-compatibility/2006" xmlns:aink="http://schemas.microsoft.com/office/drawing/2016/ink" xmlns:am3d="http://schemas.microsoft.com/office/drawing/2017/model3d" xmlns:o="urn:schemas-microsoft-com:office:office" xmlns:oel="http://schemas.microsoft.com/office/2019/extlst" xmlns:r="http://schemas.openxmlformats.org/officeDocument/2006/relationships" xmlns:m="http://schemas.openxmlformats.org/officeDocument/2006/math" xmlns:v="urn:schemas-microsoft-com:vml" xmlns:wp14="http://schemas.microsoft.com/office/word/2010/wordprocessingDrawing" xmlns:wp="http://schemas.openxmlformats.org/drawingml/2006/wordprocessingDrawing" xmlns:w10="urn:schemas-microsoft-com:office:word" xmlns:w="http://schemas.openxmlformats.org/wordprocessingml/2006/main" xmlns:w14="http://schemas.microsoft.com/office/word/2010/wordml" xmlns:w15="http://schemas.microsoft.com/office/word/2012/wordml" xmlns:w16cex="http://schemas.microsoft.com/office/word/2018/wordml/cex" xmlns:w16cid="http://schemas.microsoft.com/office/word/2016/wordml/cid" xmlns:w16="http://schemas.microsoft.com/office/word/2018/wordml" xmlns:w16du="http://schemas.microsoft.com/office/word/2023/wordml/word16du" xmlns:w16sdtdh="http://schemas.microsoft.com/office/word/2020/wordml/sdtdatahash" xmlns:w16sdtfl="http://schemas.microsoft.com/office/word/2024/wordml/sdtformatlock" xmlns:w16se="http://schemas.microsoft.com/office/word/2015/wordml/symex" xmlns:wpg="http://schemas.microsoft.com/office/word/2010/wordprocessingGroup" xmlns:wpi="http://schemas.microsoft.com/office/word/2010/wordprocessingInk" xmlns:wne="http://schemas.microsoft.com/office/word/2006/wordml" xmlns:wps="http://schemas.microsoft.com/office/word/2010/wordprocessingShape" mc:Ignorable="w14 w15 w16se w16cid w16 w16cex w16sdtdh w16sdtfl w16du wp14">
   <w:p>
     <w:pPr>
       <w:pStyle w:val="Header"/>
@@ -34221,7 +34234,7 @@
 </file>
 
 <file path=word/numbering.xml><?xml version="1.0" encoding="utf-8"?>
-<w:numbering xmlns:wpc="http://schemas.microsoft.com/office/word/2010/wordprocessingCanvas" xmlns:cx="http://schemas.microsoft.com/office/drawing/2014/chartex" xmlns:cx1="http://schemas.microsoft.com/office/drawing/2015/9/8/chartex" xmlns:cx2="http://schemas.microsoft.com/office/drawing/2015/10/21/chartex" xmlns:cx3="http://schemas.microsoft.com/office/drawing/2016/5/9/chartex" xmlns:cx4="http://schemas.microsoft.com/office/drawing/2016/5/10/chartex" xmlns:cx5="http://schemas.microsoft.com/office/drawing/2016/5/11/chartex" xmlns:cx6="http://schemas.microsoft.com/office/drawing/2016/5/12/chartex" xmlns:cx7="http://schemas.microsoft.com/office/drawing/2016/5/13/chartex" xmlns:cx8="http://schemas.microsoft.com/office/drawing/2016/5/14/chartex" xmlns:mc="http://schemas.openxmlformats.org/markup-compatibility/2006" xmlns:aink="http://schemas.microsoft.com/office/drawing/2016/ink" xmlns:am3d="http://schemas.microsoft.com/office/drawing/2017/model3d" xmlns:o="urn:schemas-microsoft-com:office:office" xmlns:oel="http://schemas.microsoft.com/office/2019/extlst" xmlns:r="http://schemas.openxmlformats.org/officeDocument/2006/relationships" xmlns:m="http://schemas.openxmlformats.org/officeDocument/2006/math" xmlns:v="urn:schemas-microsoft-com:vml" xmlns:wp14="http://schemas.microsoft.com/office/word/2010/wordprocessingDrawing" xmlns:wp="http://schemas.openxmlformats.org/drawingml/2006/wordprocessingDrawing" xmlns:w10="urn:schemas-microsoft-com:office:word" xmlns:w="http://schemas.openxmlformats.org/wordprocessingml/2006/main" xmlns:w14="http://schemas.microsoft.com/office/word/2010/wordml" xmlns:w15="http://schemas.microsoft.com/office/word/2012/wordml" xmlns:w16cei="http://schemas.microsoft.com/office/word/2026/wordml/cei" xmlns:w16cex="http://schemas.microsoft.com/office/word/2018/wordml/cex" xmlns:w16cid="http://schemas.microsoft.com/office/word/2016/wordml/cid" xmlns:w16="http://schemas.microsoft.com/office/word/2018/wordml" xmlns:w16du="http://schemas.microsoft.com/office/word/2023/wordml/word16du" xmlns:w16sdtdh="http://schemas.microsoft.com/office/word/2020/wordml/sdtdatahash" xmlns:w16sdtfl="http://schemas.microsoft.com/office/word/2024/wordml/sdtformatlock" xmlns:w16se="http://schemas.microsoft.com/office/word/2015/wordml/symex" xmlns:wpg="http://schemas.microsoft.com/office/word/2010/wordprocessingGroup" xmlns:wpi="http://schemas.microsoft.com/office/word/2010/wordprocessingInk" xmlns:wne="http://schemas.microsoft.com/office/word/2006/wordml" xmlns:wps="http://schemas.microsoft.com/office/word/2010/wordprocessingShape" mc:Ignorable="w14 w15 w16se w16cid w16 w16cex w16sdtdh w16sdtfl w16du wp14">
+<w:numbering xmlns:wpc="http://schemas.microsoft.com/office/word/2010/wordprocessingCanvas" xmlns:cx="http://schemas.microsoft.com/office/drawing/2014/chartex" xmlns:cx1="http://schemas.microsoft.com/office/drawing/2015/9/8/chartex" xmlns:cx2="http://schemas.microsoft.com/office/drawing/2015/10/21/chartex" xmlns:cx3="http://schemas.microsoft.com/office/drawing/2016/5/9/chartex" xmlns:cx4="http://schemas.microsoft.com/office/drawing/2016/5/10/chartex" xmlns:cx5="http://schemas.microsoft.com/office/drawing/2016/5/11/chartex" xmlns:cx6="http://schemas.microsoft.com/office/drawing/2016/5/12/chartex" xmlns:cx7="http://schemas.microsoft.com/office/drawing/2016/5/13/chartex" xmlns:cx8="http://schemas.microsoft.com/office/drawing/2016/5/14/chartex" xmlns:mc="http://schemas.openxmlformats.org/markup-compatibility/2006" xmlns:aink="http://schemas.microsoft.com/office/drawing/2016/ink" xmlns:am3d="http://schemas.microsoft.com/office/drawing/2017/model3d" xmlns:o="urn:schemas-microsoft-com:office:office" xmlns:oel="http://schemas.microsoft.com/office/2019/extlst" xmlns:r="http://schemas.openxmlformats.org/officeDocument/2006/relationships" xmlns:m="http://schemas.openxmlformats.org/officeDocument/2006/math" xmlns:v="urn:schemas-microsoft-com:vml" xmlns:wp14="http://schemas.microsoft.com/office/word/2010/wordprocessingDrawing" xmlns:wp="http://schemas.openxmlformats.org/drawingml/2006/wordprocessingDrawing" xmlns:w10="urn:schemas-microsoft-com:office:word" xmlns:w="http://schemas.openxmlformats.org/wordprocessingml/2006/main" xmlns:w14="http://schemas.microsoft.com/office/word/2010/wordml" xmlns:w15="http://schemas.microsoft.com/office/word/2012/wordml" xmlns:w16cex="http://schemas.microsoft.com/office/word/2018/wordml/cex" xmlns:w16cid="http://schemas.microsoft.com/office/word/2016/wordml/cid" xmlns:w16="http://schemas.microsoft.com/office/word/2018/wordml" xmlns:w16du="http://schemas.microsoft.com/office/word/2023/wordml/word16du" xmlns:w16sdtdh="http://schemas.microsoft.com/office/word/2020/wordml/sdtdatahash" xmlns:w16sdtfl="http://schemas.microsoft.com/office/word/2024/wordml/sdtformatlock" xmlns:w16se="http://schemas.microsoft.com/office/word/2015/wordml/symex" xmlns:wpg="http://schemas.microsoft.com/office/word/2010/wordprocessingGroup" xmlns:wpi="http://schemas.microsoft.com/office/word/2010/wordprocessingInk" xmlns:wne="http://schemas.microsoft.com/office/word/2006/wordml" xmlns:wps="http://schemas.microsoft.com/office/word/2010/wordprocessingShape" mc:Ignorable="w14 w15 w16se w16cid w16 w16cex w16sdtdh w16sdtfl w16du wp14">
   <w:abstractNum w:abstractNumId="0" w15:restartNumberingAfterBreak="0">
     <w:nsid w:val="FFFFFF7C"/>
     <w:multiLevelType w:val="singleLevel"/>

</xml_diff>